<commit_message>
Complete batch normalization equations
</commit_message>
<xml_diff>
--- a/mydocuments/Revision4/Sikolia_Thesis_Revision_4.docx
+++ b/mydocuments/Revision4/Sikolia_Thesis_Revision_4.docx
@@ -190,7 +190,21 @@
         <w:rPr>
           <w:rFonts w:ascii="Times New Roman" w:hAnsi="Times New Roman" w:cs="Times New Roman"/>
         </w:rPr>
-        <w:t>Wycliffe Atswenje Sikolia</w:t>
+        <w:t xml:space="preserve">Wycliffe </w:t>
+      </w:r>
+      <w:proofErr w:type="spellStart"/>
+      <w:r>
+        <w:rPr>
+          <w:rFonts w:ascii="Times New Roman" w:hAnsi="Times New Roman" w:cs="Times New Roman"/>
+        </w:rPr>
+        <w:t>Atswenje</w:t>
+      </w:r>
+      <w:proofErr w:type="spellEnd"/>
+      <w:r>
+        <w:rPr>
+          <w:rFonts w:ascii="Times New Roman" w:hAnsi="Times New Roman" w:cs="Times New Roman"/>
+        </w:rPr>
+        <w:t xml:space="preserve"> Sikolia</w:t>
       </w:r>
     </w:p>
     <w:p>
@@ -345,7 +359,21 @@
         <w:rPr>
           <w:rFonts w:ascii="Times New Roman" w:hAnsi="Times New Roman" w:cs="Times New Roman"/>
         </w:rPr>
-        <w:t>Wycliffe Atswenje Sikolia</w:t>
+        <w:t xml:space="preserve">Wycliffe </w:t>
+      </w:r>
+      <w:proofErr w:type="spellStart"/>
+      <w:r>
+        <w:rPr>
+          <w:rFonts w:ascii="Times New Roman" w:hAnsi="Times New Roman" w:cs="Times New Roman"/>
+        </w:rPr>
+        <w:t>Atswenje</w:t>
+      </w:r>
+      <w:proofErr w:type="spellEnd"/>
+      <w:r>
+        <w:rPr>
+          <w:rFonts w:ascii="Times New Roman" w:hAnsi="Times New Roman" w:cs="Times New Roman"/>
+        </w:rPr>
+        <w:t xml:space="preserve"> Sikolia</w:t>
       </w:r>
     </w:p>
     <w:p>
@@ -6918,7 +6946,21 @@
         <w:rPr>
           <w:rFonts w:ascii="Times New Roman" w:hAnsi="Times New Roman" w:cs="Times New Roman"/>
         </w:rPr>
-        <w:t>A huge chunk of solutions in computer vision make the assumption that there is a single illuminant lighting in an image. Regardless, that is not always the case. As evidenced, Finlayson and Fredembach (2007) reveal that images always contain shadows depending on the positions from different lights that affect an image. Important to the debate is the truth that Finlayson (2018) proposes a solution to the problems arising from illumination in computer vision.</w:t>
+        <w:t xml:space="preserve">A huge chunk of solutions in computer vision make the assumption that there is a single illuminant lighting in an image. Regardless, that is not always the case. As evidenced, Finlayson and </w:t>
+      </w:r>
+      <w:proofErr w:type="spellStart"/>
+      <w:r>
+        <w:rPr>
+          <w:rFonts w:ascii="Times New Roman" w:hAnsi="Times New Roman" w:cs="Times New Roman"/>
+        </w:rPr>
+        <w:t>Fredembach</w:t>
+      </w:r>
+      <w:proofErr w:type="spellEnd"/>
+      <w:r>
+        <w:rPr>
+          <w:rFonts w:ascii="Times New Roman" w:hAnsi="Times New Roman" w:cs="Times New Roman"/>
+        </w:rPr>
+        <w:t xml:space="preserve"> (2007) reveal that images always contain shadows depending on the positions from different lights that affect an image. Important to the debate is the truth that Finlayson (2018) proposes a solution to the problems arising from illumination in computer vision.</w:t>
       </w:r>
     </w:p>
     <w:p>
@@ -7016,8 +7058,16 @@
         <w:rPr>
           <w:rFonts w:ascii="Times New Roman" w:hAnsi="Times New Roman" w:cs="Times New Roman"/>
         </w:rPr>
-        <w:t xml:space="preserve"> based method because it uses statistical methods on facial landmarks. Celiktutan</w:t>
-      </w:r>
+        <w:t xml:space="preserve"> based method because it uses statistical methods on facial landmarks. </w:t>
+      </w:r>
+      <w:proofErr w:type="spellStart"/>
+      <w:r>
+        <w:rPr>
+          <w:rFonts w:ascii="Times New Roman" w:hAnsi="Times New Roman" w:cs="Times New Roman"/>
+        </w:rPr>
+        <w:t>Celiktutan</w:t>
+      </w:r>
+      <w:proofErr w:type="spellEnd"/>
       <w:r>
         <w:rPr>
           <w:rFonts w:ascii="Times New Roman" w:hAnsi="Times New Roman" w:cs="Times New Roman"/>
@@ -7087,7 +7137,21 @@
           <w:rFonts w:ascii="Times New Roman" w:hAnsi="Times New Roman" w:cs="Times New Roman"/>
         </w:rPr>
         <w:tab/>
-        <w:t xml:space="preserve">This method functions to extract facial image features to gain the Euclidean distance value served as input face comparison value of the users’ faces stored in the database (Hidayat, Wibowo, Satria, Winursito, 2021). Simply put, the </w:t>
+        <w:t xml:space="preserve">This method functions to extract facial image features to gain the Euclidean distance value served as input face comparison value of the users’ faces stored in the database (Hidayat, Wibowo, Satria, </w:t>
+      </w:r>
+      <w:proofErr w:type="spellStart"/>
+      <w:r>
+        <w:rPr>
+          <w:rFonts w:ascii="Times New Roman" w:hAnsi="Times New Roman" w:cs="Times New Roman"/>
+        </w:rPr>
+        <w:t>Winursito</w:t>
+      </w:r>
+      <w:proofErr w:type="spellEnd"/>
+      <w:r>
+        <w:rPr>
+          <w:rFonts w:ascii="Times New Roman" w:hAnsi="Times New Roman" w:cs="Times New Roman"/>
+        </w:rPr>
+        <w:t xml:space="preserve">, 2021). Simply put, the </w:t>
       </w:r>
       <w:proofErr w:type="gramStart"/>
       <w:r>
@@ -7511,7 +7575,35 @@
         <w:rPr>
           <w:rFonts w:ascii="Times New Roman" w:hAnsi="Times New Roman" w:cs="Times New Roman"/>
         </w:rPr>
-        <w:t xml:space="preserve"> method for facial recognition. For instance, Struc and Pavesic (2009) examine the performance of </w:t>
+        <w:t xml:space="preserve"> method for facial recognition. For instance, </w:t>
+      </w:r>
+      <w:proofErr w:type="spellStart"/>
+      <w:r>
+        <w:rPr>
+          <w:rFonts w:ascii="Times New Roman" w:hAnsi="Times New Roman" w:cs="Times New Roman"/>
+        </w:rPr>
+        <w:t>Struc</w:t>
+      </w:r>
+      <w:proofErr w:type="spellEnd"/>
+      <w:r>
+        <w:rPr>
+          <w:rFonts w:ascii="Times New Roman" w:hAnsi="Times New Roman" w:cs="Times New Roman"/>
+        </w:rPr>
+        <w:t xml:space="preserve"> and </w:t>
+      </w:r>
+      <w:proofErr w:type="spellStart"/>
+      <w:r>
+        <w:rPr>
+          <w:rFonts w:ascii="Times New Roman" w:hAnsi="Times New Roman" w:cs="Times New Roman"/>
+        </w:rPr>
+        <w:t>Pavesic</w:t>
+      </w:r>
+      <w:proofErr w:type="spellEnd"/>
+      <w:r>
+        <w:rPr>
+          <w:rFonts w:ascii="Times New Roman" w:hAnsi="Times New Roman" w:cs="Times New Roman"/>
+        </w:rPr>
+        <w:t xml:space="preserve"> (2009) examine the performance of </w:t>
       </w:r>
       <w:proofErr w:type="gramStart"/>
       <w:r>
@@ -7721,8 +7813,16 @@
         <w:rPr>
           <w:rFonts w:ascii="Times New Roman" w:hAnsi="Times New Roman" w:cs="Times New Roman"/>
         </w:rPr>
-        <w:t>(2011) assert that ANNs require a lot of time to train a model. The problem becomes even worse if the number of neurons and hidden layers required to train a model is high. This problem is controversial because neural networks are known to register a high accuracy when a high number of neurons and hidden layers are used. Every neuron in each layer can make calculations independent of other neurons implying that graphics processing units could help solve the time problem required to train an ANN model. Another problem associated with ANNs is the vanishing gradient problem. Tarnate</w:t>
-      </w:r>
+        <w:t xml:space="preserve">(2011) assert that ANNs require a lot of time to train a model. The problem becomes even worse if the number of neurons and hidden layers required to train a model is high. This problem is controversial because neural networks are known to register a high accuracy when a high number of neurons and hidden layers are used. Every neuron in each layer can make calculations independent of other neurons implying that graphics processing units could help solve the time problem required to train an ANN model. Another problem associated with ANNs is the vanishing gradient problem. </w:t>
+      </w:r>
+      <w:proofErr w:type="spellStart"/>
+      <w:r>
+        <w:rPr>
+          <w:rFonts w:ascii="Times New Roman" w:hAnsi="Times New Roman" w:cs="Times New Roman"/>
+        </w:rPr>
+        <w:t>Tarnate</w:t>
+      </w:r>
+      <w:proofErr w:type="spellEnd"/>
       <w:r>
         <w:rPr>
           <w:rFonts w:ascii="Times New Roman" w:hAnsi="Times New Roman" w:cs="Times New Roman"/>
@@ -7779,7 +7879,21 @@
           <w:rFonts w:ascii="Times New Roman" w:hAnsi="Times New Roman" w:cs="Times New Roman"/>
         </w:rPr>
         <w:lastRenderedPageBreak/>
-        <w:t xml:space="preserve">activation function layer, which makes them different from ANNs. Koodalsamy, </w:t>
+        <w:t xml:space="preserve">activation function layer, which makes them different from ANNs. </w:t>
+      </w:r>
+      <w:proofErr w:type="spellStart"/>
+      <w:r>
+        <w:rPr>
+          <w:rFonts w:ascii="Times New Roman" w:hAnsi="Times New Roman" w:cs="Times New Roman"/>
+        </w:rPr>
+        <w:t>Koodalsamy</w:t>
+      </w:r>
+      <w:proofErr w:type="spellEnd"/>
+      <w:r>
+        <w:rPr>
+          <w:rFonts w:ascii="Times New Roman" w:hAnsi="Times New Roman" w:cs="Times New Roman"/>
+        </w:rPr>
+        <w:t xml:space="preserve">, </w:t>
       </w:r>
       <w:r>
         <w:rPr>
@@ -7806,8 +7920,13 @@
         <w:tab/>
         <w:t xml:space="preserve">Like artificial neural networks, convolution neural networks have been used for facial recognition widely. For example, Xiaobo et al., (2023) recognize that facial recognition is hampered by factors such as posture, light and the background of the image. As a result, the authors proposed the addition of an attention mechanism to convolution neural networks in a bid to reduce the effects of factors that affect facial recognition. In a different paper, He et al., (2023) recognize that the existing methods on facial recognition ignore the effect of spatial relationships between predictors. Consequently, the authors introduced the use of a Group Depth-Wise Transpose Attention (GDTA) block, which is designed to establish long range dependencies in different facial features. This led to the development of a lightweight face recognition model, which the authors call </w:t>
       </w:r>
-      <w:r>
-        <w:t>CFormerFaceNet.</w:t>
+      <w:proofErr w:type="spellStart"/>
+      <w:r>
+        <w:t>CFormerFaceNet</w:t>
+      </w:r>
+      <w:proofErr w:type="spellEnd"/>
+      <w:r>
+        <w:t>.</w:t>
       </w:r>
       <w:r>
         <w:rPr>
@@ -9731,11 +9850,33 @@
         </w:rPr>
         <w:t xml:space="preserve">from </w:t>
       </w:r>
+      <w:proofErr w:type="spellStart"/>
       <w:r>
         <w:rPr>
           <w:color w:val="000000"/>
         </w:rPr>
-        <w:t xml:space="preserve">Alrasheedi et al., (2023). The authors acknowledge that padding has been investigated shallowly. It is then, that they propose a padding technique that learns from shifts in hyper parameters of a CNN before adjusting padding effectively. Finally, Alrasheedi et al., (2023) introduce a padding module providing evidence that it performs better 1.49% and 0.44% more better in classification accuracy than the zero padding when tested on the VGG16 and ResNet50. Clearly a considerable number of publications investigating how padding affects convolution neural networks have been made. Regardless, the number of publications that investigate how padding affects CNNs in computer vision still remain </w:t>
+        <w:t>Alrasheedi</w:t>
+      </w:r>
+      <w:proofErr w:type="spellEnd"/>
+      <w:r>
+        <w:rPr>
+          <w:color w:val="000000"/>
+        </w:rPr>
+        <w:t xml:space="preserve"> et al., (2023). The authors acknowledge that padding has been investigated shallowly. It is then, that they propose a padding technique that learns from shifts in hyper parameters of a CNN before adjusting padding effectively. Finally, </w:t>
+      </w:r>
+      <w:proofErr w:type="spellStart"/>
+      <w:r>
+        <w:rPr>
+          <w:color w:val="000000"/>
+        </w:rPr>
+        <w:t>Alrasheedi</w:t>
+      </w:r>
+      <w:proofErr w:type="spellEnd"/>
+      <w:r>
+        <w:rPr>
+          <w:color w:val="000000"/>
+        </w:rPr>
+        <w:t xml:space="preserve"> et al., (2023) introduce a padding module providing evidence that it performs better 1.49% and 0.44% more better in classification accuracy than the zero padding when tested on the VGG16 and ResNet50. Clearly a considerable number of publications investigating how padding affects convolution neural networks have been made. Regardless, the number of publications that investigate how padding affects CNNs in computer vision still remain </w:t>
       </w:r>
       <w:r>
         <w:rPr>
@@ -10029,7 +10170,21 @@
         <w:rPr>
           <w:lang w:val="en-KE"/>
         </w:rPr>
-        <w:t xml:space="preserve">ghlight that this dataset has been used and cited by authors widely. For example, Ibrahem and Abdulameer (2023) examine a pretrained model that was created from this dataset to </w:t>
+        <w:t xml:space="preserve">ghlight that this dataset has been used and cited by authors widely. For example, Ibrahem and </w:t>
+      </w:r>
+      <w:proofErr w:type="spellStart"/>
+      <w:r>
+        <w:rPr>
+          <w:lang w:val="en-KE"/>
+        </w:rPr>
+        <w:t>Abdulameer</w:t>
+      </w:r>
+      <w:proofErr w:type="spellEnd"/>
+      <w:r>
+        <w:rPr>
+          <w:lang w:val="en-KE"/>
+        </w:rPr>
+        <w:t xml:space="preserve"> (2023) examine a pretrained model that was created from this dataset to </w:t>
       </w:r>
       <w:r>
         <w:rPr>
@@ -10077,11 +10232,19 @@
         </w:rPr>
       </w:pPr>
       <w:bookmarkStart w:id="47" w:name="_Toc178527559"/>
+      <w:proofErr w:type="spellStart"/>
       <w:r>
         <w:rPr>
           <w:lang w:val="en-KE"/>
         </w:rPr>
-        <w:t>KomNET Face Dataset</w:t>
+        <w:t>KomNET</w:t>
+      </w:r>
+      <w:proofErr w:type="spellEnd"/>
+      <w:r>
+        <w:rPr>
+          <w:lang w:val="en-KE"/>
+        </w:rPr>
+        <w:t xml:space="preserve"> Face Dataset</w:t>
       </w:r>
       <w:bookmarkEnd w:id="47"/>
     </w:p>
@@ -10103,12 +10266,26 @@
         <w:rPr>
           <w:lang w:val="en-KE"/>
         </w:rPr>
-        <w:t xml:space="preserve">The KomNET face dataset </w:t>
-      </w:r>
+        <w:t xml:space="preserve">The </w:t>
+      </w:r>
+      <w:proofErr w:type="spellStart"/>
       <w:r>
         <w:rPr>
           <w:lang w:val="en-KE"/>
         </w:rPr>
+        <w:t>KomNET</w:t>
+      </w:r>
+      <w:proofErr w:type="spellEnd"/>
+      <w:r>
+        <w:rPr>
+          <w:lang w:val="en-KE"/>
+        </w:rPr>
+        <w:t xml:space="preserve"> face dataset </w:t>
+      </w:r>
+      <w:r>
+        <w:rPr>
+          <w:lang w:val="en-KE"/>
+        </w:rPr>
         <w:t>comprises of 39,600 images but the number of people whose faces were collected from is not stated in the publication associated with the dataset</w:t>
       </w:r>
       <w:r>
@@ -10117,6 +10294,7 @@
         </w:rPr>
         <w:t xml:space="preserve"> (</w:t>
       </w:r>
+      <w:proofErr w:type="spellStart"/>
       <w:r>
         <w:rPr>
           <w:rStyle w:val="Emphasis"/>
@@ -10127,6 +10305,7 @@
         </w:rPr>
         <w:t>Astawa</w:t>
       </w:r>
+      <w:proofErr w:type="spellEnd"/>
       <w:r>
         <w:rPr>
           <w:lang w:val="en-KE"/>
@@ -10193,6 +10372,7 @@
         </w:rPr>
         <w:t xml:space="preserve"> (</w:t>
       </w:r>
+      <w:proofErr w:type="spellStart"/>
       <w:r>
         <w:rPr>
           <w:rStyle w:val="Emphasis"/>
@@ -10203,6 +10383,7 @@
         </w:rPr>
         <w:t>Astawa</w:t>
       </w:r>
+      <w:proofErr w:type="spellEnd"/>
       <w:r>
         <w:rPr>
           <w:lang w:val="en-KE"/>
@@ -10243,21 +10424,39 @@
       <w:r>
         <w:t xml:space="preserve">Specifically, the authors in question discuss architectures such as FaceNet, DeepFace, </w:t>
       </w:r>
-      <w:r>
-        <w:t>DeepID-Net</w:t>
+      <w:proofErr w:type="spellStart"/>
+      <w:r>
+        <w:t>DeepID</w:t>
+      </w:r>
+      <w:proofErr w:type="spellEnd"/>
+      <w:r>
+        <w:t>-Net</w:t>
       </w:r>
       <w:r>
         <w:t xml:space="preserve">, and Local binary patterns architectures. Gupta (2017) also reviewed some of the existing architectures in facial recognition. In particular, the author discusses architectures like </w:t>
       </w:r>
+      <w:proofErr w:type="spellStart"/>
       <w:r>
         <w:lastRenderedPageBreak/>
-        <w:t>WebFace, DeepFace,</w:t>
+        <w:t>WebFace</w:t>
+      </w:r>
+      <w:proofErr w:type="spellEnd"/>
+      <w:r>
+        <w:t>, DeepFace,</w:t>
       </w:r>
       <w:r>
         <w:t xml:space="preserve"> </w:t>
       </w:r>
       <w:r>
-        <w:t xml:space="preserve">VGG Net, FaceNet, and DeepId. Critical to the discussion is that fact that the number of existing architectures could be more than 30 implying that discussing all these architectures would be daunting. It follows that </w:t>
+        <w:t xml:space="preserve">VGG Net, FaceNet, and </w:t>
+      </w:r>
+      <w:proofErr w:type="spellStart"/>
+      <w:r>
+        <w:t>DeepId</w:t>
+      </w:r>
+      <w:proofErr w:type="spellEnd"/>
+      <w:r>
+        <w:t xml:space="preserve">. Critical to the discussion is that fact that the number of existing architectures could be more than 30 implying that discussing all these architectures would be daunting. It follows that </w:t>
       </w:r>
       <w:r>
         <w:t>this paper will only discuss selected architectures in order to stick to the scope of the paper.</w:t>
@@ -10357,9 +10556,11 @@
       <w:r>
         <w:t xml:space="preserve">DeepFace was also produced by a giant company in technology. Specifically, Meta. Critical to the discussion is the fact </w:t>
       </w:r>
+      <w:proofErr w:type="spellStart"/>
       <w:r>
         <w:t>Taigman</w:t>
       </w:r>
+      <w:proofErr w:type="spellEnd"/>
       <w:r>
         <w:t xml:space="preserve"> et al., (2014) published</w:t>
       </w:r>
@@ -10372,9 +10573,11 @@
       <w:r>
         <w:t xml:space="preserve"> 3D modelling based on face fiducial points, which in turn is used to align faces. Simply put, the facial alignment methodology proposed by </w:t>
       </w:r>
+      <w:proofErr w:type="spellStart"/>
       <w:r>
         <w:t>Taigman</w:t>
       </w:r>
+      <w:proofErr w:type="spellEnd"/>
       <w:r>
         <w:t xml:space="preserve"> et al., (2014) can transform an image shown in </w:t>
       </w:r>
@@ -10393,9 +10596,11 @@
       <w:r>
         <w:t xml:space="preserve">Resulting images from facial alignment are then subjected to a deep convolution neural network architecture that is thoroughly documented by </w:t>
       </w:r>
+      <w:proofErr w:type="spellStart"/>
       <w:r>
         <w:t>Taigman</w:t>
       </w:r>
+      <w:proofErr w:type="spellEnd"/>
       <w:r>
         <w:t xml:space="preserve"> et al., (2014). Vital to the </w:t>
       </w:r>
@@ -10580,10 +10785,34 @@
         <w:t xml:space="preserve"> Specifically, it is made up of 16 layers where the first thirteen layers are convolution layers while the last three layers are fully connected layers. </w:t>
       </w:r>
       <w:r>
-        <w:t xml:space="preserve">Critical to the discussion is the fact that the input image must have a dimension of 224 by 224 by 3. The sixteen layers used by this facial architecture can be divided into five major groups. Each of these groups contains convolution layers, a relu activation function, maxpooling, kernel filters, strides and padding. A thorough explanation of this facial recognition architecture has been published by Koo et al., (2018). </w:t>
-      </w:r>
-      <w:r>
-        <w:t xml:space="preserve">It is important to mention that like Google Facenet and DeepFace, VGGFACE-16 was also tested on famous datasets such as the </w:t>
+        <w:t xml:space="preserve">Critical to the discussion is the fact that the input image must have a dimension of 224 by 224 by 3. The sixteen layers used by this facial architecture can be divided into five major groups. Each of these groups contains convolution layers, a </w:t>
+      </w:r>
+      <w:proofErr w:type="spellStart"/>
+      <w:r>
+        <w:t>relu</w:t>
+      </w:r>
+      <w:proofErr w:type="spellEnd"/>
+      <w:r>
+        <w:t xml:space="preserve"> activation function, </w:t>
+      </w:r>
+      <w:proofErr w:type="spellStart"/>
+      <w:r>
+        <w:t>maxpooling</w:t>
+      </w:r>
+      <w:proofErr w:type="spellEnd"/>
+      <w:r>
+        <w:t xml:space="preserve">, kernel filters, strides and padding. A thorough explanation of this facial recognition architecture has been published by Koo et al., (2018). </w:t>
+      </w:r>
+      <w:r>
+        <w:t xml:space="preserve">It is important to mention that like Google </w:t>
+      </w:r>
+      <w:proofErr w:type="spellStart"/>
+      <w:r>
+        <w:t>Facenet</w:t>
+      </w:r>
+      <w:proofErr w:type="spellEnd"/>
+      <w:r>
+        <w:t xml:space="preserve"> and DeepFace, VGGFACE-16 was also tested on famous datasets such as the </w:t>
       </w:r>
       <w:r>
         <w:t>Labeled Faces in the Wild dataset</w:t>
@@ -12230,6 +12459,7 @@
         </w:rPr>
         <w:t xml:space="preserve"> be the weight matrices denoting the value of the synaptic weight that connects the j</w:t>
       </w:r>
+      <w:proofErr w:type="spellStart"/>
       <w:r>
         <w:rPr>
           <w:rFonts w:ascii="Times New Roman" w:hAnsi="Times New Roman" w:cs="Times New Roman"/>
@@ -12237,6 +12467,7 @@
         </w:rPr>
         <w:t>th</w:t>
       </w:r>
+      <w:proofErr w:type="spellEnd"/>
       <w:r>
         <w:rPr>
           <w:rFonts w:ascii="Times New Roman" w:hAnsi="Times New Roman" w:cs="Times New Roman"/>
@@ -12319,6 +12550,7 @@
         </w:rPr>
         <w:t xml:space="preserve"> Is the synaptic weight connecting the j</w:t>
       </w:r>
+      <w:proofErr w:type="spellStart"/>
       <w:r>
         <w:rPr>
           <w:rFonts w:ascii="Times New Roman" w:hAnsi="Times New Roman" w:cs="Times New Roman"/>
@@ -12326,6 +12558,7 @@
         </w:rPr>
         <w:t>th</w:t>
       </w:r>
+      <w:proofErr w:type="spellEnd"/>
       <w:r>
         <w:rPr>
           <w:rFonts w:ascii="Times New Roman" w:hAnsi="Times New Roman" w:cs="Times New Roman"/>
@@ -12408,6 +12641,7 @@
         </w:rPr>
         <w:t xml:space="preserve"> Is the synaptic weight connecting the j</w:t>
       </w:r>
+      <w:proofErr w:type="spellStart"/>
       <w:r>
         <w:rPr>
           <w:rFonts w:ascii="Times New Roman" w:hAnsi="Times New Roman" w:cs="Times New Roman"/>
@@ -12415,6 +12649,7 @@
         </w:rPr>
         <w:t>th</w:t>
       </w:r>
+      <w:proofErr w:type="spellEnd"/>
       <w:r>
         <w:rPr>
           <w:rFonts w:ascii="Times New Roman" w:hAnsi="Times New Roman" w:cs="Times New Roman"/>
@@ -12497,6 +12732,7 @@
         </w:rPr>
         <w:t xml:space="preserve"> Is the synaptic weight connecting the j</w:t>
       </w:r>
+      <w:proofErr w:type="spellStart"/>
       <w:r>
         <w:rPr>
           <w:rFonts w:ascii="Times New Roman" w:hAnsi="Times New Roman" w:cs="Times New Roman"/>
@@ -12504,6 +12740,7 @@
         </w:rPr>
         <w:t>th</w:t>
       </w:r>
+      <w:proofErr w:type="spellEnd"/>
       <w:r>
         <w:rPr>
           <w:rFonts w:ascii="Times New Roman" w:hAnsi="Times New Roman" w:cs="Times New Roman"/>
@@ -12682,12 +12919,14 @@
       <w:r>
         <w:t xml:space="preserve"> be vectors whose elements denote the weighted inputs of the j</w:t>
       </w:r>
+      <w:proofErr w:type="spellStart"/>
       <w:r>
         <w:rPr>
           <w:vertAlign w:val="superscript"/>
         </w:rPr>
         <w:t>th</w:t>
       </w:r>
+      <w:proofErr w:type="spellEnd"/>
       <w:r>
         <w:t xml:space="preserve"> neuron of layer L and are defined as the following.</w:t>
       </w:r>
@@ -15477,12 +15716,14 @@
       <w:r>
         <w:t xml:space="preserve">  is the value produced by the jth output neuron of the network for the k</w:t>
       </w:r>
+      <w:proofErr w:type="spellStart"/>
       <w:r>
         <w:rPr>
           <w:vertAlign w:val="superscript"/>
         </w:rPr>
         <w:t>th</w:t>
       </w:r>
+      <w:proofErr w:type="spellEnd"/>
       <w:r>
         <w:t xml:space="preserve"> training sample, while </w:t>
       </w:r>
@@ -15533,7 +15774,15 @@
         </m:d>
       </m:oMath>
       <w:r>
-        <w:t xml:space="preserve"> is the corresponding desired value. If there are p training samples the performance of the backpropagation algorithm would be calculated using the mean squared error defined by</w:t>
+        <w:t xml:space="preserve"> is the corresponding desired value. If there are p training samples the perfor</w:t>
+      </w:r>
+      <w:proofErr w:type="spellStart"/>
+      <w:r>
+        <w:t>mance</w:t>
+      </w:r>
+      <w:proofErr w:type="spellEnd"/>
+      <w:r>
+        <w:t xml:space="preserve"> of the backpropagation algorithm would be calculated using the mean squared error defined by</w:t>
       </w:r>
     </w:p>
     <w:p>
@@ -17444,7 +17693,15 @@
         </m:sSup>
       </m:oMath>
       <w:r>
-        <w:t xml:space="preserve"> denotes the first order derivative of the activation function. Replacing equations </w:t>
+        <w:t xml:space="preserve"> denotes the first order derivative of the activation fun</w:t>
+      </w:r>
+      <w:proofErr w:type="spellStart"/>
+      <w:r>
+        <w:t>ction</w:t>
+      </w:r>
+      <w:proofErr w:type="spellEnd"/>
+      <w:r>
+        <w:t xml:space="preserve">. Replacing equations </w:t>
       </w:r>
       <w:r>
         <w:t>3.12</w:t>
@@ -21419,7 +21676,15 @@
         </m:sSubSup>
       </m:oMath>
       <w:r>
-        <w:t xml:space="preserve"> have been adjusted in the previous step based on errors, which will be used to adjust weights in the second intermediate layer. Moving on to parcel (i) in equation </w:t>
+        <w:t xml:space="preserve"> have been adjusted in the previous step based on errors, which will be used to adjust weights in the second intermediate layer. Moving on to parcel (</w:t>
+      </w:r>
+      <w:proofErr w:type="spellStart"/>
+      <w:r>
+        <w:t>i</w:t>
+      </w:r>
+      <w:proofErr w:type="spellEnd"/>
+      <w:r>
+        <w:t xml:space="preserve">) in equation </w:t>
       </w:r>
       <w:r>
         <w:t>3.22</w:t>
@@ -28698,8 +28963,9 @@
           <w:iCs w:val="0"/>
           <w:lang w:val="en-KE"/>
         </w:rPr>
-        <w:t xml:space="preserve">While this paper discussed padding, it has not touched on how padding is used in CNNs. This is why it is important to demonstrate how padding: -specifically zero padding, is used in convolution neural networks. This owes to the fact that the paper will </w:t>
-      </w:r>
+        <w:t xml:space="preserve">While this paper discussed padding, it has not touched on how padding is used in </w:t>
+      </w:r>
+      <w:proofErr w:type="spellStart"/>
       <w:r>
         <w:rPr>
           <w:rFonts w:ascii="Times New Roman" w:hAnsi="Times New Roman" w:cs="Times New Roman"/>
@@ -28707,7 +28973,46 @@
           <w:iCs w:val="0"/>
           <w:lang w:val="en-KE"/>
         </w:rPr>
-        <w:t>create a facial recognition model with zero padding and no padding in order to investigate the effect of padding in facial recognition. Zero padding in CNNs is achieved by adding zeros around an input image before filtering is applied to the resulting matrix in order to create a feature map</w:t>
+        <w:t>CNNs</w:t>
+      </w:r>
+      <w:proofErr w:type="spellEnd"/>
+      <w:r>
+        <w:rPr>
+          <w:rFonts w:ascii="Times New Roman" w:hAnsi="Times New Roman" w:cs="Times New Roman"/>
+          <w:i w:val="0"/>
+          <w:iCs w:val="0"/>
+          <w:lang w:val="en-KE"/>
+        </w:rPr>
+        <w:t xml:space="preserve">. This is why it is important to demonstrate how padding: -specifically zero padding, is used in convolution neural networks. This owes to the fact that the paper will </w:t>
+      </w:r>
+      <w:r>
+        <w:rPr>
+          <w:rFonts w:ascii="Times New Roman" w:hAnsi="Times New Roman" w:cs="Times New Roman"/>
+          <w:i w:val="0"/>
+          <w:iCs w:val="0"/>
+          <w:lang w:val="en-KE"/>
+        </w:rPr>
+        <w:t xml:space="preserve">create a facial recognition model with zero padding and no padding in order to investigate the effect of padding in facial recognition. Zero padding in </w:t>
+      </w:r>
+      <w:proofErr w:type="spellStart"/>
+      <w:r>
+        <w:rPr>
+          <w:rFonts w:ascii="Times New Roman" w:hAnsi="Times New Roman" w:cs="Times New Roman"/>
+          <w:i w:val="0"/>
+          <w:iCs w:val="0"/>
+          <w:lang w:val="en-KE"/>
+        </w:rPr>
+        <w:t>CNNs</w:t>
+      </w:r>
+      <w:proofErr w:type="spellEnd"/>
+      <w:r>
+        <w:rPr>
+          <w:rFonts w:ascii="Times New Roman" w:hAnsi="Times New Roman" w:cs="Times New Roman"/>
+          <w:i w:val="0"/>
+          <w:iCs w:val="0"/>
+          <w:lang w:val="en-KE"/>
+        </w:rPr>
+        <w:t xml:space="preserve"> is achieved by adding zeros around an input image before filtering is applied to the resulting matrix in order to create a feature map</w:t>
       </w:r>
       <w:r>
         <w:rPr>
@@ -28741,6 +29046,7 @@
       <w:r>
         <w:rPr>
           <w:rFonts w:ascii="Times New Roman" w:hAnsi="Times New Roman" w:cs="Times New Roman"/>
+          <w:noProof/>
           <w:lang w:val="en-KE"/>
         </w:rPr>
         <w:drawing>
@@ -28886,43 +29192,7 @@
         <w:rPr>
           <w:rFonts w:ascii="Times New Roman" w:hAnsi="Times New Roman" w:cs="Times New Roman"/>
         </w:rPr>
-        <w:t xml:space="preserve"> </w:t>
-      </w:r>
-      <w:r>
-        <w:rPr>
-          <w:rFonts w:ascii="Times New Roman" w:hAnsi="Times New Roman" w:cs="Times New Roman"/>
-        </w:rPr>
-        <w:t xml:space="preserve">Let us consider a pooling size of 2 by 2 and a feature map shown in figure </w:t>
-      </w:r>
-      <w:r>
-        <w:rPr>
-          <w:rFonts w:ascii="Times New Roman" w:hAnsi="Times New Roman" w:cs="Times New Roman"/>
-        </w:rPr>
-        <w:t>3</w:t>
-      </w:r>
-      <w:r>
-        <w:rPr>
-          <w:rFonts w:ascii="Times New Roman" w:hAnsi="Times New Roman" w:cs="Times New Roman"/>
-        </w:rPr>
-        <w:t>.</w:t>
-      </w:r>
-      <w:r>
-        <w:rPr>
-          <w:rFonts w:ascii="Times New Roman" w:hAnsi="Times New Roman" w:cs="Times New Roman"/>
-        </w:rPr>
-        <w:t>8</w:t>
-      </w:r>
-      <w:r>
-        <w:rPr>
-          <w:rFonts w:ascii="Times New Roman" w:hAnsi="Times New Roman" w:cs="Times New Roman"/>
-        </w:rPr>
-        <w:t xml:space="preserve"> below.</w:t>
-      </w:r>
-      <w:r>
-        <w:rPr>
-          <w:rFonts w:ascii="Times New Roman" w:hAnsi="Times New Roman" w:cs="Times New Roman"/>
-        </w:rPr>
-        <w:t xml:space="preserve"> Max pooling </w:t>
+        <w:t xml:space="preserve"> Let us consider a pooling size of 2 by 2 and a feature map shown in figure 3.8 below. Max pooling </w:t>
       </w:r>
       <w:r>
         <w:rPr>
@@ -28972,13 +29242,7 @@
         <w:rPr>
           <w:rFonts w:ascii="Times New Roman" w:hAnsi="Times New Roman" w:cs="Times New Roman"/>
         </w:rPr>
-        <w:t>From row R3 column C1 to row R4 column C2</w:t>
-      </w:r>
-      <w:r>
-        <w:rPr>
-          <w:rFonts w:ascii="Times New Roman" w:hAnsi="Times New Roman" w:cs="Times New Roman"/>
-        </w:rPr>
-        <w:t>.</w:t>
+        <w:t>From row R3 column C1 to row R4 column C2.</w:t>
       </w:r>
     </w:p>
     <w:p>
@@ -28997,19 +29261,7 @@
         <w:rPr>
           <w:rFonts w:ascii="Times New Roman" w:hAnsi="Times New Roman" w:cs="Times New Roman"/>
         </w:rPr>
-        <w:t>From row R1 column C</w:t>
-      </w:r>
-      <w:r>
-        <w:rPr>
-          <w:rFonts w:ascii="Times New Roman" w:hAnsi="Times New Roman" w:cs="Times New Roman"/>
-        </w:rPr>
-        <w:t>3</w:t>
-      </w:r>
-      <w:r>
-        <w:rPr>
-          <w:rFonts w:ascii="Times New Roman" w:hAnsi="Times New Roman" w:cs="Times New Roman"/>
-        </w:rPr>
-        <w:t xml:space="preserve"> to row R2 column C</w:t>
+        <w:t>From row R1 column C3 to row R2 column C</w:t>
       </w:r>
       <w:r>
         <w:rPr>
@@ -29040,55 +29292,7 @@
         <w:rPr>
           <w:rFonts w:ascii="Times New Roman" w:hAnsi="Times New Roman" w:cs="Times New Roman"/>
         </w:rPr>
-        <w:t>From row R</w:t>
-      </w:r>
-      <w:r>
-        <w:rPr>
-          <w:rFonts w:ascii="Times New Roman" w:hAnsi="Times New Roman" w:cs="Times New Roman"/>
-        </w:rPr>
-        <w:t>3</w:t>
-      </w:r>
-      <w:r>
-        <w:rPr>
-          <w:rFonts w:ascii="Times New Roman" w:hAnsi="Times New Roman" w:cs="Times New Roman"/>
-        </w:rPr>
-        <w:t xml:space="preserve"> column C</w:t>
-      </w:r>
-      <w:r>
-        <w:rPr>
-          <w:rFonts w:ascii="Times New Roman" w:hAnsi="Times New Roman" w:cs="Times New Roman"/>
-        </w:rPr>
-        <w:t>3</w:t>
-      </w:r>
-      <w:r>
-        <w:rPr>
-          <w:rFonts w:ascii="Times New Roman" w:hAnsi="Times New Roman" w:cs="Times New Roman"/>
-        </w:rPr>
-        <w:t xml:space="preserve"> to row R</w:t>
-      </w:r>
-      <w:r>
-        <w:rPr>
-          <w:rFonts w:ascii="Times New Roman" w:hAnsi="Times New Roman" w:cs="Times New Roman"/>
-        </w:rPr>
-        <w:t>4</w:t>
-      </w:r>
-      <w:r>
-        <w:rPr>
-          <w:rFonts w:ascii="Times New Roman" w:hAnsi="Times New Roman" w:cs="Times New Roman"/>
-        </w:rPr>
-        <w:t xml:space="preserve"> column C</w:t>
-      </w:r>
-      <w:r>
-        <w:rPr>
-          <w:rFonts w:ascii="Times New Roman" w:hAnsi="Times New Roman" w:cs="Times New Roman"/>
-        </w:rPr>
-        <w:t>4</w:t>
-      </w:r>
-      <w:r>
-        <w:rPr>
-          <w:rFonts w:ascii="Times New Roman" w:hAnsi="Times New Roman" w:cs="Times New Roman"/>
-        </w:rPr>
-        <w:t>.</w:t>
+        <w:t>From row R3 column C3 to row R4 column C4.</w:t>
       </w:r>
     </w:p>
     <w:p>
@@ -29155,6 +29359,7 @@
       <w:r>
         <w:rPr>
           <w:rFonts w:ascii="Times New Roman" w:hAnsi="Times New Roman" w:cs="Times New Roman"/>
+          <w:noProof/>
           <w:lang w:val="en-KE"/>
         </w:rPr>
         <w:drawing>
@@ -29282,7 +29487,523 @@
       </w:pPr>
       <w:r>
         <w:lastRenderedPageBreak/>
-        <w:t>Batch Normalization in Convolution Neural Networks</w:t>
+        <w:t>Batch Normalization</w:t>
+      </w:r>
+    </w:p>
+    <w:p>
+      <w:pPr>
+        <w:spacing w:line="480" w:lineRule="auto"/>
+        <w:ind w:firstLine="432"/>
+        <w:rPr>
+          <w:rFonts w:ascii="Times New Roman" w:hAnsi="Times New Roman" w:cs="Times New Roman"/>
+        </w:rPr>
+      </w:pPr>
+      <w:r>
+        <w:rPr>
+          <w:rFonts w:ascii="Times New Roman" w:hAnsi="Times New Roman" w:cs="Times New Roman"/>
+        </w:rPr>
+        <w:t xml:space="preserve">Batch normalization </w:t>
+      </w:r>
+      <w:r>
+        <w:rPr>
+          <w:rFonts w:ascii="Times New Roman" w:hAnsi="Times New Roman" w:cs="Times New Roman"/>
+        </w:rPr>
+        <w:t>is</w:t>
+      </w:r>
+      <w:r>
+        <w:rPr>
+          <w:rFonts w:ascii="Times New Roman" w:hAnsi="Times New Roman" w:cs="Times New Roman"/>
+        </w:rPr>
+        <w:t xml:space="preserve"> used by neural networks to improve the speed and stability of the training process. Critical to the discussion is the fact that Sergey and Szegedy (20</w:t>
+      </w:r>
+      <w:r>
+        <w:rPr>
+          <w:rFonts w:ascii="Times New Roman" w:hAnsi="Times New Roman" w:cs="Times New Roman"/>
+        </w:rPr>
+        <w:t>1</w:t>
+      </w:r>
+      <w:r>
+        <w:rPr>
+          <w:rFonts w:ascii="Times New Roman" w:hAnsi="Times New Roman" w:cs="Times New Roman"/>
+        </w:rPr>
+        <w:t xml:space="preserve">5) have a publication on some of the benefits of batch normalization. This owes to the fact that batch normalization does not only improve the speed and the stability of the training process, but also reduces the internal covariate shift. The term internal covariate shift could be defined as a phenomenon where the distribution of outputs of a </w:t>
+      </w:r>
+      <w:r>
+        <w:rPr>
+          <w:rFonts w:ascii="Times New Roman" w:hAnsi="Times New Roman" w:cs="Times New Roman"/>
+        </w:rPr>
+        <w:t>neural network change</w:t>
+      </w:r>
+      <w:r>
+        <w:rPr>
+          <w:rFonts w:ascii="Times New Roman" w:hAnsi="Times New Roman" w:cs="Times New Roman"/>
+        </w:rPr>
+        <w:t xml:space="preserve"> when the model is still being updated. This technique occurs by adjusting the values in each variable </w:t>
+      </w:r>
+      <w:r>
+        <w:rPr>
+          <w:rFonts w:ascii="Times New Roman" w:hAnsi="Times New Roman" w:cs="Times New Roman"/>
+        </w:rPr>
+        <w:t>using the mean, standard deviation, scaling parameter, and a bias. This is done using equation 3.39 below. It is important to highlight that the scaling parameter and the bias, like the weights of a neural network, are adjusted in order to minimize the loss function.</w:t>
+      </w:r>
+    </w:p>
+    <w:p>
+      <w:pPr>
+        <w:pStyle w:val="Caption"/>
+        <w:rPr>
+          <w:rFonts w:ascii="Times New Roman" w:hAnsi="Times New Roman" w:cs="Times New Roman"/>
+        </w:rPr>
+      </w:pPr>
+      <m:oMath>
+        <m:sSub>
+          <m:sSubPr>
+            <m:ctrlPr>
+              <w:rPr>
+                <w:rFonts w:ascii="Cambria Math" w:hAnsi="Cambria Math" w:cs="Times New Roman"/>
+                <w:iCs w:val="0"/>
+              </w:rPr>
+            </m:ctrlPr>
+          </m:sSubPr>
+          <m:e>
+            <m:r>
+              <m:rPr>
+                <m:sty m:val="p"/>
+              </m:rPr>
+              <w:rPr>
+                <w:rFonts w:ascii="Cambria Math" w:hAnsi="Cambria Math" w:cs="Times New Roman"/>
+              </w:rPr>
+              <m:t>y</m:t>
+            </m:r>
+          </m:e>
+          <m:sub>
+            <m:r>
+              <m:rPr>
+                <m:sty m:val="p"/>
+              </m:rPr>
+              <w:rPr>
+                <w:rFonts w:ascii="Cambria Math" w:hAnsi="Cambria Math" w:cs="Times New Roman"/>
+              </w:rPr>
+              <m:t>i</m:t>
+            </m:r>
+          </m:sub>
+        </m:sSub>
+        <m:r>
+          <m:rPr>
+            <m:sty m:val="p"/>
+          </m:rPr>
+          <w:rPr>
+            <w:rFonts w:ascii="Cambria Math" w:hAnsi="Cambria Math" w:cs="Times New Roman"/>
+          </w:rPr>
+          <m:t>= γ</m:t>
+        </m:r>
+        <m:acc>
+          <m:accPr>
+            <m:ctrlPr>
+              <w:rPr>
+                <w:rFonts w:ascii="Cambria Math" w:hAnsi="Cambria Math" w:cs="Times New Roman"/>
+                <w:iCs w:val="0"/>
+              </w:rPr>
+            </m:ctrlPr>
+          </m:accPr>
+          <m:e>
+            <m:sSub>
+              <m:sSubPr>
+                <m:ctrlPr>
+                  <w:rPr>
+                    <w:rFonts w:ascii="Cambria Math" w:hAnsi="Cambria Math" w:cs="Times New Roman"/>
+                    <w:iCs w:val="0"/>
+                  </w:rPr>
+                </m:ctrlPr>
+              </m:sSubPr>
+              <m:e>
+                <m:r>
+                  <m:rPr>
+                    <m:sty m:val="p"/>
+                  </m:rPr>
+                  <w:rPr>
+                    <w:rFonts w:ascii="Cambria Math" w:hAnsi="Cambria Math" w:cs="Times New Roman"/>
+                  </w:rPr>
+                  <m:t>x</m:t>
+                </m:r>
+              </m:e>
+              <m:sub>
+                <m:r>
+                  <m:rPr>
+                    <m:sty m:val="p"/>
+                  </m:rPr>
+                  <w:rPr>
+                    <w:rFonts w:ascii="Cambria Math" w:hAnsi="Cambria Math" w:cs="Times New Roman"/>
+                  </w:rPr>
+                  <m:t>i</m:t>
+                </m:r>
+              </m:sub>
+            </m:sSub>
+          </m:e>
+        </m:acc>
+        <m:r>
+          <m:rPr>
+            <m:sty m:val="p"/>
+          </m:rPr>
+          <w:rPr>
+            <w:rFonts w:ascii="Cambria Math" w:hAnsi="Cambria Math" w:cs="Times New Roman"/>
+          </w:rPr>
+          <m:t>+β</m:t>
+        </m:r>
+      </m:oMath>
+      <w:r>
+        <w:rPr>
+          <w:rFonts w:ascii="Times New Roman" w:hAnsi="Times New Roman" w:cs="Times New Roman"/>
+        </w:rPr>
+        <w:t xml:space="preserve">          </w:t>
+      </w:r>
+      <w:r>
+        <w:rPr>
+          <w:rFonts w:ascii="Times New Roman" w:hAnsi="Times New Roman" w:cs="Times New Roman"/>
+          <w:i w:val="0"/>
+          <w:iCs w:val="0"/>
+        </w:rPr>
+        <w:t>where</w:t>
+      </w:r>
+      <w:r>
+        <w:rPr>
+          <w:rFonts w:ascii="Times New Roman" w:hAnsi="Times New Roman" w:cs="Times New Roman"/>
+        </w:rPr>
+        <w:t xml:space="preserve">                                                                                                           </w:t>
+      </w:r>
+      <w:r>
+        <w:rPr>
+          <w:rFonts w:ascii="Times New Roman" w:hAnsi="Times New Roman" w:cs="Times New Roman"/>
+        </w:rPr>
+        <w:fldChar w:fldCharType="begin"/>
+      </w:r>
+      <w:r>
+        <w:rPr>
+          <w:rFonts w:ascii="Times New Roman" w:hAnsi="Times New Roman" w:cs="Times New Roman"/>
+        </w:rPr>
+        <w:instrText xml:space="preserve"> STYLEREF 1 \s </w:instrText>
+      </w:r>
+      <w:r>
+        <w:rPr>
+          <w:rFonts w:ascii="Times New Roman" w:hAnsi="Times New Roman" w:cs="Times New Roman"/>
+        </w:rPr>
+        <w:fldChar w:fldCharType="separate"/>
+      </w:r>
+      <w:r>
+        <w:rPr>
+          <w:rFonts w:ascii="Times New Roman" w:hAnsi="Times New Roman" w:cs="Times New Roman"/>
+          <w:noProof/>
+        </w:rPr>
+        <w:t>0</w:t>
+      </w:r>
+      <w:r>
+        <w:rPr>
+          <w:rFonts w:ascii="Times New Roman" w:hAnsi="Times New Roman" w:cs="Times New Roman"/>
+        </w:rPr>
+        <w:fldChar w:fldCharType="end"/>
+      </w:r>
+      <w:r>
+        <w:rPr>
+          <w:rFonts w:ascii="Times New Roman" w:hAnsi="Times New Roman" w:cs="Times New Roman"/>
+        </w:rPr>
+        <w:t>.</w:t>
+      </w:r>
+      <w:r>
+        <w:rPr>
+          <w:rFonts w:ascii="Times New Roman" w:hAnsi="Times New Roman" w:cs="Times New Roman"/>
+        </w:rPr>
+        <w:fldChar w:fldCharType="begin"/>
+      </w:r>
+      <w:r>
+        <w:rPr>
+          <w:rFonts w:ascii="Times New Roman" w:hAnsi="Times New Roman" w:cs="Times New Roman"/>
+        </w:rPr>
+        <w:instrText xml:space="preserve"> SEQ Equation \* ARABIC \s 1 </w:instrText>
+      </w:r>
+      <w:r>
+        <w:rPr>
+          <w:rFonts w:ascii="Times New Roman" w:hAnsi="Times New Roman" w:cs="Times New Roman"/>
+        </w:rPr>
+        <w:fldChar w:fldCharType="separate"/>
+      </w:r>
+      <w:r>
+        <w:rPr>
+          <w:rFonts w:ascii="Times New Roman" w:hAnsi="Times New Roman" w:cs="Times New Roman"/>
+          <w:noProof/>
+        </w:rPr>
+        <w:t>39</w:t>
+      </w:r>
+      <w:r>
+        <w:rPr>
+          <w:rFonts w:ascii="Times New Roman" w:hAnsi="Times New Roman" w:cs="Times New Roman"/>
+        </w:rPr>
+        <w:fldChar w:fldCharType="end"/>
+      </w:r>
+    </w:p>
+    <w:p>
+      <w:pPr>
+        <w:pStyle w:val="Caption"/>
+        <w:rPr>
+          <w:rFonts w:ascii="Times New Roman" w:hAnsi="Times New Roman" w:cs="Times New Roman"/>
+          <w:i w:val="0"/>
+          <w:iCs w:val="0"/>
+        </w:rPr>
+      </w:pPr>
+      <m:oMath>
+        <m:acc>
+          <m:accPr>
+            <m:ctrlPr>
+              <w:rPr>
+                <w:rFonts w:ascii="Cambria Math" w:hAnsi="Cambria Math" w:cs="Times New Roman"/>
+              </w:rPr>
+            </m:ctrlPr>
+          </m:accPr>
+          <m:e>
+            <m:sSub>
+              <m:sSubPr>
+                <m:ctrlPr>
+                  <w:rPr>
+                    <w:rFonts w:ascii="Cambria Math" w:hAnsi="Cambria Math" w:cs="Times New Roman"/>
+                  </w:rPr>
+                </m:ctrlPr>
+              </m:sSubPr>
+              <m:e>
+                <m:r>
+                  <w:rPr>
+                    <w:rFonts w:ascii="Cambria Math" w:hAnsi="Cambria Math" w:cs="Times New Roman"/>
+                  </w:rPr>
+                  <m:t>x</m:t>
+                </m:r>
+              </m:e>
+              <m:sub>
+                <m:r>
+                  <w:rPr>
+                    <w:rFonts w:ascii="Cambria Math" w:hAnsi="Cambria Math" w:cs="Times New Roman"/>
+                  </w:rPr>
+                  <m:t>i</m:t>
+                </m:r>
+              </m:sub>
+            </m:sSub>
+          </m:e>
+        </m:acc>
+        <m:r>
+          <w:rPr>
+            <w:rFonts w:ascii="Cambria Math" w:hAnsi="Cambria Math" w:cs="Times New Roman"/>
+          </w:rPr>
+          <m:t xml:space="preserve">= </m:t>
+        </m:r>
+        <m:f>
+          <m:fPr>
+            <m:ctrlPr>
+              <w:rPr>
+                <w:rFonts w:ascii="Cambria Math" w:hAnsi="Cambria Math" w:cs="Times New Roman"/>
+              </w:rPr>
+            </m:ctrlPr>
+          </m:fPr>
+          <m:num>
+            <m:sSub>
+              <m:sSubPr>
+                <m:ctrlPr>
+                  <w:rPr>
+                    <w:rFonts w:ascii="Cambria Math" w:hAnsi="Cambria Math" w:cs="Times New Roman"/>
+                  </w:rPr>
+                </m:ctrlPr>
+              </m:sSubPr>
+              <m:e>
+                <m:r>
+                  <w:rPr>
+                    <w:rFonts w:ascii="Cambria Math" w:hAnsi="Cambria Math" w:cs="Times New Roman"/>
+                  </w:rPr>
+                  <m:t>x</m:t>
+                </m:r>
+              </m:e>
+              <m:sub>
+                <m:r>
+                  <w:rPr>
+                    <w:rFonts w:ascii="Cambria Math" w:hAnsi="Cambria Math" w:cs="Times New Roman"/>
+                  </w:rPr>
+                  <m:t xml:space="preserve">i </m:t>
+                </m:r>
+              </m:sub>
+            </m:sSub>
+            <m:r>
+              <w:rPr>
+                <w:rFonts w:ascii="Cambria Math" w:hAnsi="Cambria Math" w:cs="Times New Roman"/>
+              </w:rPr>
+              <m:t xml:space="preserve">- </m:t>
+            </m:r>
+            <m:sSub>
+              <m:sSubPr>
+                <m:ctrlPr>
+                  <w:rPr>
+                    <w:rFonts w:ascii="Cambria Math" w:hAnsi="Cambria Math" w:cs="Times New Roman"/>
+                  </w:rPr>
+                </m:ctrlPr>
+              </m:sSubPr>
+              <m:e>
+                <m:r>
+                  <w:rPr>
+                    <w:rFonts w:ascii="Cambria Math" w:hAnsi="Cambria Math" w:cs="Times New Roman"/>
+                  </w:rPr>
+                  <m:t>μ</m:t>
+                </m:r>
+              </m:e>
+              <m:sub>
+                <m:r>
+                  <w:rPr>
+                    <w:rFonts w:ascii="Cambria Math" w:hAnsi="Cambria Math" w:cs="Times New Roman"/>
+                  </w:rPr>
+                  <m:t>β</m:t>
+                </m:r>
+              </m:sub>
+            </m:sSub>
+          </m:num>
+          <m:den>
+            <m:rad>
+              <m:radPr>
+                <m:degHide m:val="1"/>
+                <m:ctrlPr>
+                  <w:rPr>
+                    <w:rFonts w:ascii="Cambria Math" w:hAnsi="Cambria Math" w:cs="Times New Roman"/>
+                  </w:rPr>
+                </m:ctrlPr>
+              </m:radPr>
+              <m:deg/>
+              <m:e>
+                <m:sSubSup>
+                  <m:sSubSupPr>
+                    <m:ctrlPr>
+                      <w:rPr>
+                        <w:rFonts w:ascii="Cambria Math" w:hAnsi="Cambria Math" w:cs="Times New Roman"/>
+                      </w:rPr>
+                    </m:ctrlPr>
+                  </m:sSubSupPr>
+                  <m:e>
+                    <m:r>
+                      <w:rPr>
+                        <w:rFonts w:ascii="Cambria Math" w:hAnsi="Cambria Math" w:cs="Times New Roman"/>
+                      </w:rPr>
+                      <m:t>δ</m:t>
+                    </m:r>
+                  </m:e>
+                  <m:sub>
+                    <m:r>
+                      <w:rPr>
+                        <w:rFonts w:ascii="Cambria Math" w:hAnsi="Cambria Math" w:cs="Times New Roman"/>
+                      </w:rPr>
+                      <m:t>β</m:t>
+                    </m:r>
+                  </m:sub>
+                  <m:sup>
+                    <m:r>
+                      <w:rPr>
+                        <w:rFonts w:ascii="Cambria Math" w:hAnsi="Cambria Math" w:cs="Times New Roman"/>
+                      </w:rPr>
+                      <m:t>2</m:t>
+                    </m:r>
+                  </m:sup>
+                </m:sSubSup>
+              </m:e>
+            </m:rad>
+            <m:r>
+              <w:rPr>
+                <w:rFonts w:ascii="Cambria Math" w:hAnsi="Cambria Math" w:cs="Times New Roman"/>
+              </w:rPr>
+              <m:t>+ε</m:t>
+            </m:r>
+          </m:den>
+        </m:f>
+        <m:r>
+          <w:rPr>
+            <w:rFonts w:ascii="Cambria Math" w:hAnsi="Cambria Math" w:cs="Times New Roman"/>
+          </w:rPr>
+          <m:t xml:space="preserve">  </m:t>
+        </m:r>
+      </m:oMath>
+      <w:r>
+        <w:rPr>
+          <w:rFonts w:ascii="Times New Roman" w:hAnsi="Times New Roman" w:cs="Times New Roman"/>
+          <w:i w:val="0"/>
+        </w:rPr>
+        <w:t xml:space="preserve">                                                                                                                                </w:t>
+      </w:r>
+      <w:r>
+        <w:rPr>
+          <w:rFonts w:ascii="Times New Roman" w:hAnsi="Times New Roman" w:cs="Times New Roman"/>
+          <w:i w:val="0"/>
+        </w:rPr>
+        <w:fldChar w:fldCharType="begin"/>
+      </w:r>
+      <w:r>
+        <w:rPr>
+          <w:rFonts w:ascii="Times New Roman" w:hAnsi="Times New Roman" w:cs="Times New Roman"/>
+          <w:i w:val="0"/>
+        </w:rPr>
+        <w:instrText xml:space="preserve"> STYLEREF 1 \s </w:instrText>
+      </w:r>
+      <w:r>
+        <w:rPr>
+          <w:rFonts w:ascii="Times New Roman" w:hAnsi="Times New Roman" w:cs="Times New Roman"/>
+          <w:i w:val="0"/>
+        </w:rPr>
+        <w:fldChar w:fldCharType="separate"/>
+      </w:r>
+      <w:r>
+        <w:rPr>
+          <w:rFonts w:ascii="Times New Roman" w:hAnsi="Times New Roman" w:cs="Times New Roman"/>
+          <w:i w:val="0"/>
+          <w:noProof/>
+        </w:rPr>
+        <w:t>0</w:t>
+      </w:r>
+      <w:r>
+        <w:rPr>
+          <w:rFonts w:ascii="Times New Roman" w:hAnsi="Times New Roman" w:cs="Times New Roman"/>
+          <w:i w:val="0"/>
+        </w:rPr>
+        <w:fldChar w:fldCharType="end"/>
+      </w:r>
+      <w:r>
+        <w:rPr>
+          <w:rFonts w:ascii="Times New Roman" w:hAnsi="Times New Roman" w:cs="Times New Roman"/>
+          <w:i w:val="0"/>
+        </w:rPr>
+        <w:t>.</w:t>
+      </w:r>
+      <w:r>
+        <w:rPr>
+          <w:rFonts w:ascii="Times New Roman" w:hAnsi="Times New Roman" w:cs="Times New Roman"/>
+          <w:i w:val="0"/>
+        </w:rPr>
+        <w:fldChar w:fldCharType="begin"/>
+      </w:r>
+      <w:r>
+        <w:rPr>
+          <w:rFonts w:ascii="Times New Roman" w:hAnsi="Times New Roman" w:cs="Times New Roman"/>
+          <w:i w:val="0"/>
+        </w:rPr>
+        <w:instrText xml:space="preserve"> SEQ Equation \* ARABIC \s 1 </w:instrText>
+      </w:r>
+      <w:r>
+        <w:rPr>
+          <w:rFonts w:ascii="Times New Roman" w:hAnsi="Times New Roman" w:cs="Times New Roman"/>
+          <w:i w:val="0"/>
+        </w:rPr>
+        <w:fldChar w:fldCharType="separate"/>
+      </w:r>
+      <w:r>
+        <w:rPr>
+          <w:rFonts w:ascii="Times New Roman" w:hAnsi="Times New Roman" w:cs="Times New Roman"/>
+          <w:i w:val="0"/>
+          <w:noProof/>
+        </w:rPr>
+        <w:t>40</w:t>
+      </w:r>
+      <w:r>
+        <w:rPr>
+          <w:rFonts w:ascii="Times New Roman" w:hAnsi="Times New Roman" w:cs="Times New Roman"/>
+          <w:i w:val="0"/>
+        </w:rPr>
+        <w:fldChar w:fldCharType="end"/>
       </w:r>
     </w:p>
     <w:p>
@@ -40139,6 +40860,7 @@
   <w:style w:type="character" w:default="1" w:styleId="DefaultParagraphFont">
     <w:name w:val="Default Paragraph Font"/>
     <w:uiPriority w:val="1"/>
+    <w:semiHidden/>
     <w:unhideWhenUsed/>
   </w:style>
   <w:style w:type="table" w:default="1" w:styleId="TableNormal">

</xml_diff>

<commit_message>
Start workingg on rmarkdown methodology
</commit_message>
<xml_diff>
--- a/mydocuments/Revision4/Sikolia_Thesis_Revision_4.docx
+++ b/mydocuments/Revision4/Sikolia_Thesis_Revision_4.docx
@@ -7092,21 +7092,7 @@
         <w:rPr>
           <w:rFonts w:ascii="Times New Roman" w:hAnsi="Times New Roman" w:cs="Times New Roman"/>
         </w:rPr>
-        <w:t xml:space="preserve"> feature invariant based methods and concluded that the texture based method is more accurate. However, the authors argue that feature </w:t>
-      </w:r>
-      <w:proofErr w:type="gramStart"/>
-      <w:r>
-        <w:rPr>
-          <w:rFonts w:ascii="Times New Roman" w:hAnsi="Times New Roman" w:cs="Times New Roman"/>
-        </w:rPr>
-        <w:t>invariant based</w:t>
-      </w:r>
-      <w:proofErr w:type="gramEnd"/>
-      <w:r>
-        <w:rPr>
-          <w:rFonts w:ascii="Times New Roman" w:hAnsi="Times New Roman" w:cs="Times New Roman"/>
-        </w:rPr>
-        <w:t xml:space="preserve"> methods are computationally expensive.</w:t>
+        <w:t xml:space="preserve"> feature invariant based methods and concluded that the texture based method is more accurate. However, the authors argue that feature invariant based methods are computationally expensive.</w:t>
       </w:r>
     </w:p>
     <w:p>
@@ -10904,6 +10890,42 @@
       <w:pPr>
         <w:pStyle w:val="Heading2"/>
       </w:pPr>
+      <w:r>
+        <w:t>Introduction</w:t>
+      </w:r>
+    </w:p>
+    <w:p>
+      <w:pPr>
+        <w:pStyle w:val="BodyText"/>
+        <w:spacing w:before="240" w:line="480" w:lineRule="auto"/>
+        <w:ind w:firstLine="576"/>
+      </w:pPr>
+      <w:r>
+        <w:t xml:space="preserve">This section discusses the theory behind neural networks </w:t>
+      </w:r>
+      <w:r>
+        <w:t>by</w:t>
+      </w:r>
+      <w:r>
+        <w:t xml:space="preserve"> </w:t>
+      </w:r>
+      <w:r>
+        <w:t xml:space="preserve">deriving the back propagation algorithm. The section also discusses techniques used in </w:t>
+      </w:r>
+      <w:r>
+        <w:t xml:space="preserve">convolution </w:t>
+      </w:r>
+      <w:r>
+        <w:t>neural networks by describing how CNNs extract data from images. Specifically, this section focusses on major techniques used in CNNs such as filtering, strides, padding, pooling and batch normalization.</w:t>
+      </w:r>
+      <w:r>
+        <w:t xml:space="preserve"> </w:t>
+      </w:r>
+    </w:p>
+    <w:p>
+      <w:pPr>
+        <w:pStyle w:val="Heading2"/>
+      </w:pPr>
       <w:bookmarkStart w:id="54" w:name="_Toc178527565"/>
       <w:r>
         <w:t>Artificial Neural Networks</w:t>
@@ -11246,6 +11268,7 @@
         <w:rPr>
           <w:rFonts w:ascii="Times New Roman" w:hAnsi="Times New Roman" w:cs="Times New Roman"/>
         </w:rPr>
+        <w:lastRenderedPageBreak/>
         <w:tab/>
       </w:r>
     </w:p>
@@ -11327,14 +11350,7 @@
         <w:rPr>
           <w:rFonts w:ascii="Times New Roman" w:hAnsi="Times New Roman" w:cs="Times New Roman"/>
         </w:rPr>
-        <w:t xml:space="preserve">) with </w:t>
-      </w:r>
-      <w:r>
-        <w:rPr>
-          <w:rFonts w:ascii="Times New Roman" w:hAnsi="Times New Roman" w:cs="Times New Roman"/>
-        </w:rPr>
-        <w:lastRenderedPageBreak/>
-        <w:t>weights (W</w:t>
+        <w:t>) with weights (W</w:t>
       </w:r>
       <w:r>
         <w:rPr>
@@ -11689,6 +11705,7 @@
           <w:rFonts w:ascii="Times New Roman" w:hAnsi="Times New Roman" w:cs="Times New Roman"/>
           <w:noProof/>
         </w:rPr>
+        <w:lastRenderedPageBreak/>
         <w:drawing>
           <wp:anchor distT="0" distB="0" distL="0" distR="0" simplePos="0" relativeHeight="251660288" behindDoc="0" locked="0" layoutInCell="0" allowOverlap="1" wp14:anchorId="12939943" wp14:editId="019A7816">
             <wp:simplePos x="0" y="0"/>
@@ -11982,7 +11999,6 @@
         <w:rPr>
           <w:rFonts w:ascii="Times New Roman" w:hAnsi="Times New Roman" w:cs="Times New Roman"/>
         </w:rPr>
-        <w:lastRenderedPageBreak/>
         <w:t>Thus, the perceptron of a single layer neural network is shown in the formula</w:t>
       </w:r>
       <w:r>
@@ -12459,7 +12475,6 @@
         </w:rPr>
         <w:t xml:space="preserve"> be the weight matrices denoting the value of the synaptic weight that connects the j</w:t>
       </w:r>
-      <w:proofErr w:type="spellStart"/>
       <w:r>
         <w:rPr>
           <w:rFonts w:ascii="Times New Roman" w:hAnsi="Times New Roman" w:cs="Times New Roman"/>
@@ -12467,7 +12482,6 @@
         </w:rPr>
         <w:t>th</w:t>
       </w:r>
-      <w:proofErr w:type="spellEnd"/>
       <w:r>
         <w:rPr>
           <w:rFonts w:ascii="Times New Roman" w:hAnsi="Times New Roman" w:cs="Times New Roman"/>
@@ -12550,7 +12564,6 @@
         </w:rPr>
         <w:t xml:space="preserve"> Is the synaptic weight connecting the j</w:t>
       </w:r>
-      <w:proofErr w:type="spellStart"/>
       <w:r>
         <w:rPr>
           <w:rFonts w:ascii="Times New Roman" w:hAnsi="Times New Roman" w:cs="Times New Roman"/>
@@ -12558,7 +12571,6 @@
         </w:rPr>
         <w:t>th</w:t>
       </w:r>
-      <w:proofErr w:type="spellEnd"/>
       <w:r>
         <w:rPr>
           <w:rFonts w:ascii="Times New Roman" w:hAnsi="Times New Roman" w:cs="Times New Roman"/>
@@ -12641,7 +12653,6 @@
         </w:rPr>
         <w:t xml:space="preserve"> Is the synaptic weight connecting the j</w:t>
       </w:r>
-      <w:proofErr w:type="spellStart"/>
       <w:r>
         <w:rPr>
           <w:rFonts w:ascii="Times New Roman" w:hAnsi="Times New Roman" w:cs="Times New Roman"/>
@@ -12649,7 +12660,6 @@
         </w:rPr>
         <w:t>th</w:t>
       </w:r>
-      <w:proofErr w:type="spellEnd"/>
       <w:r>
         <w:rPr>
           <w:rFonts w:ascii="Times New Roman" w:hAnsi="Times New Roman" w:cs="Times New Roman"/>
@@ -12732,7 +12742,6 @@
         </w:rPr>
         <w:t xml:space="preserve"> Is the synaptic weight connecting the j</w:t>
       </w:r>
-      <w:proofErr w:type="spellStart"/>
       <w:r>
         <w:rPr>
           <w:rFonts w:ascii="Times New Roman" w:hAnsi="Times New Roman" w:cs="Times New Roman"/>
@@ -12740,7 +12749,6 @@
         </w:rPr>
         <w:t>th</w:t>
       </w:r>
-      <w:proofErr w:type="spellEnd"/>
       <w:r>
         <w:rPr>
           <w:rFonts w:ascii="Times New Roman" w:hAnsi="Times New Roman" w:cs="Times New Roman"/>
@@ -12780,6 +12788,7 @@
         <w:rPr>
           <w:noProof/>
         </w:rPr>
+        <w:lastRenderedPageBreak/>
         <w:drawing>
           <wp:inline distT="0" distB="0" distL="0" distR="0" wp14:anchorId="62750752" wp14:editId="3EA6D1EB">
             <wp:extent cx="4171950" cy="2581275"/>
@@ -12877,7 +12886,6 @@
         <w:spacing w:line="480" w:lineRule="auto"/>
       </w:pPr>
       <w:r>
-        <w:lastRenderedPageBreak/>
         <w:t xml:space="preserve">Let </w:t>
       </w:r>
       <m:oMath>
@@ -12919,14 +12927,12 @@
       <w:r>
         <w:t xml:space="preserve"> be vectors whose elements denote the weighted inputs of the j</w:t>
       </w:r>
-      <w:proofErr w:type="spellStart"/>
       <w:r>
         <w:rPr>
           <w:vertAlign w:val="superscript"/>
         </w:rPr>
         <w:t>th</w:t>
       </w:r>
-      <w:proofErr w:type="spellEnd"/>
       <w:r>
         <w:t xml:space="preserve"> neuron of layer L and are defined as the following.</w:t>
       </w:r>
@@ -15326,6 +15332,7 @@
           <w:rPr>
             <w:rFonts w:ascii="Cambria Math" w:hAnsi="Cambria Math"/>
           </w:rPr>
+          <w:lastRenderedPageBreak/>
           <m:t>E</m:t>
         </m:r>
         <m:d>
@@ -15716,14 +15723,12 @@
       <w:r>
         <w:t xml:space="preserve">  is the value produced by the jth output neuron of the network for the k</w:t>
       </w:r>
-      <w:proofErr w:type="spellStart"/>
       <w:r>
         <w:rPr>
           <w:vertAlign w:val="superscript"/>
         </w:rPr>
         <w:t>th</w:t>
       </w:r>
-      <w:proofErr w:type="spellEnd"/>
       <w:r>
         <w:t xml:space="preserve"> training sample, while </w:t>
       </w:r>
@@ -15774,15 +15779,7 @@
         </m:d>
       </m:oMath>
       <w:r>
-        <w:t xml:space="preserve"> is the corresponding desired value. If there are p training samples the perfor</w:t>
-      </w:r>
-      <w:proofErr w:type="spellStart"/>
-      <w:r>
-        <w:t>mance</w:t>
-      </w:r>
-      <w:proofErr w:type="spellEnd"/>
-      <w:r>
-        <w:t xml:space="preserve"> of the backpropagation algorithm would be calculated using the mean squared error defined by</w:t>
+        <w:t xml:space="preserve"> is the corresponding desired value. If there are p training samples the performance of the backpropagation algorithm would be calculated using the mean squared error defined by</w:t>
       </w:r>
     </w:p>
     <w:p>
@@ -16074,11 +16071,7 @@
         <w:t>3.9</w:t>
       </w:r>
       <w:r>
-        <w:t xml:space="preserve">. In order to communicate the derivation of the backpropagation algorithm the process will be divided into two parts. The first part will focus </w:t>
-      </w:r>
-      <w:r>
-        <w:lastRenderedPageBreak/>
-        <w:t xml:space="preserve">on the synaptic adjustment of weight matrix </w:t>
+        <w:t xml:space="preserve">. In order to communicate the derivation of the backpropagation algorithm the process will be divided into two parts. The first part will focus on the synaptic adjustment of weight matrix </w:t>
       </w:r>
       <m:oMath>
         <m:sSubSup>
@@ -17693,15 +17686,7 @@
         </m:sSup>
       </m:oMath>
       <w:r>
-        <w:t xml:space="preserve"> denotes the first order derivative of the activation fun</w:t>
-      </w:r>
-      <w:proofErr w:type="spellStart"/>
-      <w:r>
-        <w:t>ction</w:t>
-      </w:r>
-      <w:proofErr w:type="spellEnd"/>
-      <w:r>
-        <w:t xml:space="preserve">. Replacing equations </w:t>
+        <w:t xml:space="preserve"> denotes the first order derivative of the activation function. Replacing equations </w:t>
       </w:r>
       <w:r>
         <w:t>3.12</w:t>
@@ -19205,7 +19190,6 @@
         <w:spacing w:line="480" w:lineRule="auto"/>
       </w:pPr>
       <w:r>
-        <w:lastRenderedPageBreak/>
         <w:t>In short, we have shown through equation</w:t>
       </w:r>
       <w:r>
@@ -21151,6 +21135,7 @@
         <w:spacing w:line="480" w:lineRule="auto"/>
       </w:pPr>
       <w:r>
+        <w:lastRenderedPageBreak/>
         <w:t xml:space="preserve">Note that the partial derivative of parcel (ii) with respect to </w:t>
       </w:r>
       <m:oMath>
@@ -21690,11 +21675,7 @@
         <w:t>3.22</w:t>
       </w:r>
       <w:r>
-        <w:t xml:space="preserve">, the result can be simplified by </w:t>
-      </w:r>
-      <w:r>
-        <w:lastRenderedPageBreak/>
-        <w:t xml:space="preserve">multiplying equations </w:t>
+        <w:t xml:space="preserve">, the result can be simplified by multiplying equations </w:t>
       </w:r>
       <w:r>
         <w:t>3.13</w:t>
@@ -23765,6 +23746,7 @@
         <w:ind w:firstLine="720"/>
       </w:pPr>
       <w:r>
+        <w:lastRenderedPageBreak/>
         <w:t xml:space="preserve">The objective of the training process of the first hidden layer consists of adjusting the weight matrix </w:t>
       </w:r>
       <m:oMath>
@@ -28236,7 +28218,6 @@
         <w:spacing w:line="480" w:lineRule="auto"/>
       </w:pPr>
       <w:r>
-        <w:lastRenderedPageBreak/>
         <w:t>T</w:t>
       </w:r>
       <w:r>
@@ -28394,6 +28375,7 @@
         </w:rPr>
       </w:pPr>
       <w:r>
+        <w:lastRenderedPageBreak/>
         <w:t xml:space="preserve">Figure </w:t>
       </w:r>
       <w:r>
@@ -28585,14 +28567,7 @@
         <w:rPr>
           <w:rFonts w:ascii="Times New Roman" w:hAnsi="Times New Roman" w:cs="Times New Roman"/>
         </w:rPr>
-        <w:t xml:space="preserve">takes a 3 by 3 matrix from row R1 column C2 to row R3 </w:t>
-      </w:r>
-      <w:r>
-        <w:rPr>
-          <w:rFonts w:ascii="Times New Roman" w:hAnsi="Times New Roman" w:cs="Times New Roman"/>
-        </w:rPr>
-        <w:lastRenderedPageBreak/>
-        <w:t>column C4</w:t>
+        <w:t>takes a 3 by 3 matrix from row R1 column C2 to row R3 column C4</w:t>
       </w:r>
       <w:r>
         <w:rPr>
@@ -28810,7 +28785,11 @@
         <w:t xml:space="preserve">(assuming that we have a stride of 1) </w:t>
       </w:r>
       <w:r>
-        <w:t xml:space="preserve">and use it to explain how strides are used in convolution neural networks. The filter will begin in the same position as the filtering process i.e. </w:t>
+        <w:t xml:space="preserve">and use it to explain how strides are used in convolution neural networks. </w:t>
+      </w:r>
+      <w:r>
+        <w:lastRenderedPageBreak/>
+        <w:t xml:space="preserve">The filter will begin in the same position as the filtering process i.e. </w:t>
       </w:r>
       <w:r>
         <w:rPr>
@@ -28835,7 +28814,6 @@
           <w:noProof/>
           <w:lang w:val="en-KE"/>
         </w:rPr>
-        <w:lastRenderedPageBreak/>
         <w:drawing>
           <wp:inline distT="0" distB="0" distL="0" distR="0" wp14:anchorId="5C87E9C4" wp14:editId="09D771AC">
             <wp:extent cx="971550" cy="1209675"/>
@@ -29049,6 +29027,7 @@
           <w:noProof/>
           <w:lang w:val="en-KE"/>
         </w:rPr>
+        <w:lastRenderedPageBreak/>
         <w:drawing>
           <wp:inline distT="0" distB="0" distL="0" distR="0" wp14:anchorId="530C0A74" wp14:editId="73B85C6C">
             <wp:extent cx="4495800" cy="2508581"/>
@@ -29169,7 +29148,6 @@
         <w:pStyle w:val="Heading3"/>
       </w:pPr>
       <w:r>
-        <w:lastRenderedPageBreak/>
         <w:t>Pooling in Convolution Neural Networks</w:t>
       </w:r>
     </w:p>
@@ -29362,6 +29340,7 @@
           <w:noProof/>
           <w:lang w:val="en-KE"/>
         </w:rPr>
+        <w:lastRenderedPageBreak/>
         <w:drawing>
           <wp:inline distT="0" distB="0" distL="0" distR="0" wp14:anchorId="36663020" wp14:editId="23BB2003">
             <wp:extent cx="5400675" cy="2343150"/>
@@ -29486,7 +29465,6 @@
         <w:pStyle w:val="Heading3"/>
       </w:pPr>
       <w:r>
-        <w:lastRenderedPageBreak/>
         <w:t>Batch Normalization</w:t>
       </w:r>
     </w:p>
@@ -29566,9 +29544,6 @@
           </m:sSubPr>
           <m:e>
             <m:r>
-              <m:rPr>
-                <m:sty m:val="p"/>
-              </m:rPr>
               <w:rPr>
                 <w:rFonts w:ascii="Cambria Math" w:hAnsi="Cambria Math" w:cs="Times New Roman"/>
               </w:rPr>
@@ -29577,9 +29552,6 @@
           </m:e>
           <m:sub>
             <m:r>
-              <m:rPr>
-                <m:sty m:val="p"/>
-              </m:rPr>
               <w:rPr>
                 <w:rFonts w:ascii="Cambria Math" w:hAnsi="Cambria Math" w:cs="Times New Roman"/>
               </w:rPr>
@@ -29588,9 +29560,6 @@
           </m:sub>
         </m:sSub>
         <m:r>
-          <m:rPr>
-            <m:sty m:val="p"/>
-          </m:rPr>
           <w:rPr>
             <w:rFonts w:ascii="Cambria Math" w:hAnsi="Cambria Math" w:cs="Times New Roman"/>
           </w:rPr>
@@ -29617,9 +29586,6 @@
               </m:sSubPr>
               <m:e>
                 <m:r>
-                  <m:rPr>
-                    <m:sty m:val="p"/>
-                  </m:rPr>
                   <w:rPr>
                     <w:rFonts w:ascii="Cambria Math" w:hAnsi="Cambria Math" w:cs="Times New Roman"/>
                   </w:rPr>
@@ -29628,9 +29594,6 @@
               </m:e>
               <m:sub>
                 <m:r>
-                  <m:rPr>
-                    <m:sty m:val="p"/>
-                  </m:rPr>
                   <w:rPr>
                     <w:rFonts w:ascii="Cambria Math" w:hAnsi="Cambria Math" w:cs="Times New Roman"/>
                   </w:rPr>
@@ -29641,9 +29604,6 @@
           </m:e>
         </m:acc>
         <m:r>
-          <m:rPr>
-            <m:sty m:val="p"/>
-          </m:rPr>
           <w:rPr>
             <w:rFonts w:ascii="Cambria Math" w:hAnsi="Cambria Math" w:cs="Times New Roman"/>
           </w:rPr>

</xml_diff>

<commit_message>
Complete working on the methodology
</commit_message>
<xml_diff>
--- a/mydocuments/Revision4/Sikolia_Thesis_Revision_4.docx
+++ b/mydocuments/Revision4/Sikolia_Thesis_Revision_4.docx
@@ -8132,45 +8132,25 @@
                             <w:r>
                               <w:t xml:space="preserve">Figure </w:t>
                             </w:r>
-                            <w:r>
-                              <w:fldChar w:fldCharType="begin"/>
-                            </w:r>
-                            <w:r>
-                              <w:instrText xml:space="preserve"> STYLEREF 1 \s </w:instrText>
-                            </w:r>
-                            <w:r>
-                              <w:fldChar w:fldCharType="separate"/>
-                            </w:r>
-                            <w:r>
-                              <w:rPr>
-                                <w:noProof/>
-                              </w:rPr>
-                              <w:t>0</w:t>
-                            </w:r>
-                            <w:r>
-                              <w:fldChar w:fldCharType="end"/>
-                            </w:r>
+                            <w:fldSimple w:instr=" STYLEREF 1 \s ">
+                              <w:r>
+                                <w:rPr>
+                                  <w:noProof/>
+                                </w:rPr>
+                                <w:t>0</w:t>
+                              </w:r>
+                            </w:fldSimple>
                             <w:r>
                               <w:t>.</w:t>
                             </w:r>
-                            <w:r>
-                              <w:fldChar w:fldCharType="begin"/>
-                            </w:r>
-                            <w:r>
-                              <w:instrText xml:space="preserve"> SEQ Figure \* ARABIC \s 1 </w:instrText>
-                            </w:r>
-                            <w:r>
-                              <w:fldChar w:fldCharType="separate"/>
-                            </w:r>
-                            <w:r>
-                              <w:rPr>
-                                <w:noProof/>
-                              </w:rPr>
-                              <w:t>1</w:t>
-                            </w:r>
-                            <w:r>
-                              <w:fldChar w:fldCharType="end"/>
-                            </w:r>
+                            <w:fldSimple w:instr=" SEQ Figure \* ARABIC \s 1 ">
+                              <w:r>
+                                <w:rPr>
+                                  <w:noProof/>
+                                </w:rPr>
+                                <w:t>1</w:t>
+                              </w:r>
+                            </w:fldSimple>
                             <w:r>
                               <w:t>: Zero Padding</w:t>
                             </w:r>
@@ -8210,45 +8190,25 @@
                       <w:r>
                         <w:t xml:space="preserve">Figure </w:t>
                       </w:r>
-                      <w:r>
-                        <w:fldChar w:fldCharType="begin"/>
-                      </w:r>
-                      <w:r>
-                        <w:instrText xml:space="preserve"> STYLEREF 1 \s </w:instrText>
-                      </w:r>
-                      <w:r>
-                        <w:fldChar w:fldCharType="separate"/>
-                      </w:r>
-                      <w:r>
-                        <w:rPr>
-                          <w:noProof/>
-                        </w:rPr>
-                        <w:t>0</w:t>
-                      </w:r>
-                      <w:r>
-                        <w:fldChar w:fldCharType="end"/>
-                      </w:r>
+                      <w:fldSimple w:instr=" STYLEREF 1 \s ">
+                        <w:r>
+                          <w:rPr>
+                            <w:noProof/>
+                          </w:rPr>
+                          <w:t>0</w:t>
+                        </w:r>
+                      </w:fldSimple>
                       <w:r>
                         <w:t>.</w:t>
                       </w:r>
-                      <w:r>
-                        <w:fldChar w:fldCharType="begin"/>
-                      </w:r>
-                      <w:r>
-                        <w:instrText xml:space="preserve"> SEQ Figure \* ARABIC \s 1 </w:instrText>
-                      </w:r>
-                      <w:r>
-                        <w:fldChar w:fldCharType="separate"/>
-                      </w:r>
-                      <w:r>
-                        <w:rPr>
-                          <w:noProof/>
-                        </w:rPr>
-                        <w:t>1</w:t>
-                      </w:r>
-                      <w:r>
-                        <w:fldChar w:fldCharType="end"/>
-                      </w:r>
+                      <w:fldSimple w:instr=" SEQ Figure \* ARABIC \s 1 ">
+                        <w:r>
+                          <w:rPr>
+                            <w:noProof/>
+                          </w:rPr>
+                          <w:t>1</w:t>
+                        </w:r>
+                      </w:fldSimple>
                       <w:r>
                         <w:t>: Zero Padding</w:t>
                       </w:r>
@@ -8493,45 +8453,25 @@
                             <w:r>
                               <w:t xml:space="preserve">Figure </w:t>
                             </w:r>
-                            <w:r>
-                              <w:fldChar w:fldCharType="begin"/>
-                            </w:r>
-                            <w:r>
-                              <w:instrText xml:space="preserve"> STYLEREF 1 \s </w:instrText>
-                            </w:r>
-                            <w:r>
-                              <w:fldChar w:fldCharType="separate"/>
-                            </w:r>
-                            <w:r>
-                              <w:rPr>
-                                <w:noProof/>
-                              </w:rPr>
-                              <w:t>0</w:t>
-                            </w:r>
-                            <w:r>
-                              <w:fldChar w:fldCharType="end"/>
-                            </w:r>
+                            <w:fldSimple w:instr=" STYLEREF 1 \s ">
+                              <w:r>
+                                <w:rPr>
+                                  <w:noProof/>
+                                </w:rPr>
+                                <w:t>0</w:t>
+                              </w:r>
+                            </w:fldSimple>
                             <w:r>
                               <w:t>.</w:t>
                             </w:r>
-                            <w:r>
-                              <w:fldChar w:fldCharType="begin"/>
-                            </w:r>
-                            <w:r>
-                              <w:instrText xml:space="preserve"> SEQ Figure \* ARABIC \s 1 </w:instrText>
-                            </w:r>
-                            <w:r>
-                              <w:fldChar w:fldCharType="separate"/>
-                            </w:r>
-                            <w:r>
-                              <w:rPr>
-                                <w:noProof/>
-                              </w:rPr>
-                              <w:t>2</w:t>
-                            </w:r>
-                            <w:r>
-                              <w:fldChar w:fldCharType="end"/>
-                            </w:r>
+                            <w:fldSimple w:instr=" SEQ Figure \* ARABIC \s 1 ">
+                              <w:r>
+                                <w:rPr>
+                                  <w:noProof/>
+                                </w:rPr>
+                                <w:t>2</w:t>
+                              </w:r>
+                            </w:fldSimple>
                             <w:r>
                               <w:t>: Reflection Padding</w:t>
                             </w:r>
@@ -8568,45 +8508,25 @@
                       <w:r>
                         <w:t xml:space="preserve">Figure </w:t>
                       </w:r>
-                      <w:r>
-                        <w:fldChar w:fldCharType="begin"/>
-                      </w:r>
-                      <w:r>
-                        <w:instrText xml:space="preserve"> STYLEREF 1 \s </w:instrText>
-                      </w:r>
-                      <w:r>
-                        <w:fldChar w:fldCharType="separate"/>
-                      </w:r>
-                      <w:r>
-                        <w:rPr>
-                          <w:noProof/>
-                        </w:rPr>
-                        <w:t>0</w:t>
-                      </w:r>
-                      <w:r>
-                        <w:fldChar w:fldCharType="end"/>
-                      </w:r>
+                      <w:fldSimple w:instr=" STYLEREF 1 \s ">
+                        <w:r>
+                          <w:rPr>
+                            <w:noProof/>
+                          </w:rPr>
+                          <w:t>0</w:t>
+                        </w:r>
+                      </w:fldSimple>
                       <w:r>
                         <w:t>.</w:t>
                       </w:r>
-                      <w:r>
-                        <w:fldChar w:fldCharType="begin"/>
-                      </w:r>
-                      <w:r>
-                        <w:instrText xml:space="preserve"> SEQ Figure \* ARABIC \s 1 </w:instrText>
-                      </w:r>
-                      <w:r>
-                        <w:fldChar w:fldCharType="separate"/>
-                      </w:r>
-                      <w:r>
-                        <w:rPr>
-                          <w:noProof/>
-                        </w:rPr>
-                        <w:t>2</w:t>
-                      </w:r>
-                      <w:r>
-                        <w:fldChar w:fldCharType="end"/>
-                      </w:r>
+                      <w:fldSimple w:instr=" SEQ Figure \* ARABIC \s 1 ">
+                        <w:r>
+                          <w:rPr>
+                            <w:noProof/>
+                          </w:rPr>
+                          <w:t>2</w:t>
+                        </w:r>
+                      </w:fldSimple>
                       <w:r>
                         <w:t>: Reflection Padding</w:t>
                       </w:r>
@@ -8800,45 +8720,25 @@
                             <w:r>
                               <w:t xml:space="preserve">Figure </w:t>
                             </w:r>
-                            <w:r>
-                              <w:fldChar w:fldCharType="begin"/>
-                            </w:r>
-                            <w:r>
-                              <w:instrText xml:space="preserve"> STYLEREF 1 \s </w:instrText>
-                            </w:r>
-                            <w:r>
-                              <w:fldChar w:fldCharType="separate"/>
-                            </w:r>
-                            <w:r>
-                              <w:rPr>
-                                <w:noProof/>
-                              </w:rPr>
-                              <w:t>0</w:t>
-                            </w:r>
-                            <w:r>
-                              <w:fldChar w:fldCharType="end"/>
-                            </w:r>
+                            <w:fldSimple w:instr=" STYLEREF 1 \s ">
+                              <w:r>
+                                <w:rPr>
+                                  <w:noProof/>
+                                </w:rPr>
+                                <w:t>0</w:t>
+                              </w:r>
+                            </w:fldSimple>
                             <w:r>
                               <w:t>.</w:t>
                             </w:r>
-                            <w:r>
-                              <w:fldChar w:fldCharType="begin"/>
-                            </w:r>
-                            <w:r>
-                              <w:instrText xml:space="preserve"> SEQ Figure \* ARABIC \s 1 </w:instrText>
-                            </w:r>
-                            <w:r>
-                              <w:fldChar w:fldCharType="separate"/>
-                            </w:r>
-                            <w:r>
-                              <w:rPr>
-                                <w:noProof/>
-                              </w:rPr>
-                              <w:t>3</w:t>
-                            </w:r>
-                            <w:r>
-                              <w:fldChar w:fldCharType="end"/>
-                            </w:r>
+                            <w:fldSimple w:instr=" SEQ Figure \* ARABIC \s 1 ">
+                              <w:r>
+                                <w:rPr>
+                                  <w:noProof/>
+                                </w:rPr>
+                                <w:t>3</w:t>
+                              </w:r>
+                            </w:fldSimple>
                             <w:r>
                               <w:t>: Replication Padding</w:t>
                             </w:r>
@@ -8875,45 +8775,25 @@
                       <w:r>
                         <w:t xml:space="preserve">Figure </w:t>
                       </w:r>
-                      <w:r>
-                        <w:fldChar w:fldCharType="begin"/>
-                      </w:r>
-                      <w:r>
-                        <w:instrText xml:space="preserve"> STYLEREF 1 \s </w:instrText>
-                      </w:r>
-                      <w:r>
-                        <w:fldChar w:fldCharType="separate"/>
-                      </w:r>
-                      <w:r>
-                        <w:rPr>
-                          <w:noProof/>
-                        </w:rPr>
-                        <w:t>0</w:t>
-                      </w:r>
-                      <w:r>
-                        <w:fldChar w:fldCharType="end"/>
-                      </w:r>
+                      <w:fldSimple w:instr=" STYLEREF 1 \s ">
+                        <w:r>
+                          <w:rPr>
+                            <w:noProof/>
+                          </w:rPr>
+                          <w:t>0</w:t>
+                        </w:r>
+                      </w:fldSimple>
                       <w:r>
                         <w:t>.</w:t>
                       </w:r>
-                      <w:r>
-                        <w:fldChar w:fldCharType="begin"/>
-                      </w:r>
-                      <w:r>
-                        <w:instrText xml:space="preserve"> SEQ Figure \* ARABIC \s 1 </w:instrText>
-                      </w:r>
-                      <w:r>
-                        <w:fldChar w:fldCharType="separate"/>
-                      </w:r>
-                      <w:r>
-                        <w:rPr>
-                          <w:noProof/>
-                        </w:rPr>
-                        <w:t>3</w:t>
-                      </w:r>
-                      <w:r>
-                        <w:fldChar w:fldCharType="end"/>
-                      </w:r>
+                      <w:fldSimple w:instr=" SEQ Figure \* ARABIC \s 1 ">
+                        <w:r>
+                          <w:rPr>
+                            <w:noProof/>
+                          </w:rPr>
+                          <w:t>3</w:t>
+                        </w:r>
+                      </w:fldSimple>
                       <w:r>
                         <w:t>: Replication Padding</w:t>
                       </w:r>
@@ -9150,45 +9030,25 @@
                             <w:r>
                               <w:t xml:space="preserve">Figure </w:t>
                             </w:r>
-                            <w:r>
-                              <w:fldChar w:fldCharType="begin"/>
-                            </w:r>
-                            <w:r>
-                              <w:instrText xml:space="preserve"> STYLEREF 1 \s </w:instrText>
-                            </w:r>
-                            <w:r>
-                              <w:fldChar w:fldCharType="separate"/>
-                            </w:r>
-                            <w:r>
-                              <w:rPr>
-                                <w:noProof/>
-                              </w:rPr>
-                              <w:t>0</w:t>
-                            </w:r>
-                            <w:r>
-                              <w:fldChar w:fldCharType="end"/>
-                            </w:r>
+                            <w:fldSimple w:instr=" STYLEREF 1 \s ">
+                              <w:r>
+                                <w:rPr>
+                                  <w:noProof/>
+                                </w:rPr>
+                                <w:t>0</w:t>
+                              </w:r>
+                            </w:fldSimple>
                             <w:r>
                               <w:t>.</w:t>
                             </w:r>
-                            <w:r>
-                              <w:fldChar w:fldCharType="begin"/>
-                            </w:r>
-                            <w:r>
-                              <w:instrText xml:space="preserve"> SEQ Figure \* ARABIC \s 1 </w:instrText>
-                            </w:r>
-                            <w:r>
-                              <w:fldChar w:fldCharType="separate"/>
-                            </w:r>
-                            <w:r>
-                              <w:rPr>
-                                <w:noProof/>
-                              </w:rPr>
-                              <w:t>4</w:t>
-                            </w:r>
-                            <w:r>
-                              <w:fldChar w:fldCharType="end"/>
-                            </w:r>
+                            <w:fldSimple w:instr=" SEQ Figure \* ARABIC \s 1 ">
+                              <w:r>
+                                <w:rPr>
+                                  <w:noProof/>
+                                </w:rPr>
+                                <w:t>4</w:t>
+                              </w:r>
+                            </w:fldSimple>
                             <w:r>
                               <w:t>: Circular Padding</w:t>
                             </w:r>
@@ -9225,45 +9085,25 @@
                       <w:r>
                         <w:t xml:space="preserve">Figure </w:t>
                       </w:r>
-                      <w:r>
-                        <w:fldChar w:fldCharType="begin"/>
-                      </w:r>
-                      <w:r>
-                        <w:instrText xml:space="preserve"> STYLEREF 1 \s </w:instrText>
-                      </w:r>
-                      <w:r>
-                        <w:fldChar w:fldCharType="separate"/>
-                      </w:r>
-                      <w:r>
-                        <w:rPr>
-                          <w:noProof/>
-                        </w:rPr>
-                        <w:t>0</w:t>
-                      </w:r>
-                      <w:r>
-                        <w:fldChar w:fldCharType="end"/>
-                      </w:r>
+                      <w:fldSimple w:instr=" STYLEREF 1 \s ">
+                        <w:r>
+                          <w:rPr>
+                            <w:noProof/>
+                          </w:rPr>
+                          <w:t>0</w:t>
+                        </w:r>
+                      </w:fldSimple>
                       <w:r>
                         <w:t>.</w:t>
                       </w:r>
-                      <w:r>
-                        <w:fldChar w:fldCharType="begin"/>
-                      </w:r>
-                      <w:r>
-                        <w:instrText xml:space="preserve"> SEQ Figure \* ARABIC \s 1 </w:instrText>
-                      </w:r>
-                      <w:r>
-                        <w:fldChar w:fldCharType="separate"/>
-                      </w:r>
-                      <w:r>
-                        <w:rPr>
-                          <w:noProof/>
-                        </w:rPr>
-                        <w:t>4</w:t>
-                      </w:r>
-                      <w:r>
-                        <w:fldChar w:fldCharType="end"/>
-                      </w:r>
+                      <w:fldSimple w:instr=" SEQ Figure \* ARABIC \s 1 ">
+                        <w:r>
+                          <w:rPr>
+                            <w:noProof/>
+                          </w:rPr>
+                          <w:t>4</w:t>
+                        </w:r>
+                      </w:fldSimple>
                       <w:r>
                         <w:t>: Circular Padding</w:t>
                       </w:r>
@@ -9473,45 +9313,25 @@
                             <w:r>
                               <w:t xml:space="preserve">Figure </w:t>
                             </w:r>
-                            <w:r>
-                              <w:fldChar w:fldCharType="begin"/>
-                            </w:r>
-                            <w:r>
-                              <w:instrText xml:space="preserve"> STYLEREF 1 \s </w:instrText>
-                            </w:r>
-                            <w:r>
-                              <w:fldChar w:fldCharType="separate"/>
-                            </w:r>
-                            <w:r>
-                              <w:rPr>
-                                <w:noProof/>
-                              </w:rPr>
-                              <w:t>0</w:t>
-                            </w:r>
-                            <w:r>
-                              <w:fldChar w:fldCharType="end"/>
-                            </w:r>
+                            <w:fldSimple w:instr=" STYLEREF 1 \s ">
+                              <w:r>
+                                <w:rPr>
+                                  <w:noProof/>
+                                </w:rPr>
+                                <w:t>0</w:t>
+                              </w:r>
+                            </w:fldSimple>
                             <w:r>
                               <w:t>.</w:t>
                             </w:r>
-                            <w:r>
-                              <w:fldChar w:fldCharType="begin"/>
-                            </w:r>
-                            <w:r>
-                              <w:instrText xml:space="preserve"> SEQ Figure \* ARABIC \s 1 </w:instrText>
-                            </w:r>
-                            <w:r>
-                              <w:fldChar w:fldCharType="separate"/>
-                            </w:r>
-                            <w:r>
-                              <w:rPr>
-                                <w:noProof/>
-                              </w:rPr>
-                              <w:t>5</w:t>
-                            </w:r>
-                            <w:r>
-                              <w:fldChar w:fldCharType="end"/>
-                            </w:r>
+                            <w:fldSimple w:instr=" SEQ Figure \* ARABIC \s 1 ">
+                              <w:r>
+                                <w:rPr>
+                                  <w:noProof/>
+                                </w:rPr>
+                                <w:t>5</w:t>
+                              </w:r>
+                            </w:fldSimple>
                             <w:r>
                               <w:t>: Sequence Padding</w:t>
                             </w:r>
@@ -9547,45 +9367,25 @@
                       <w:r>
                         <w:t xml:space="preserve">Figure </w:t>
                       </w:r>
-                      <w:r>
-                        <w:fldChar w:fldCharType="begin"/>
-                      </w:r>
-                      <w:r>
-                        <w:instrText xml:space="preserve"> STYLEREF 1 \s </w:instrText>
-                      </w:r>
-                      <w:r>
-                        <w:fldChar w:fldCharType="separate"/>
-                      </w:r>
-                      <w:r>
-                        <w:rPr>
-                          <w:noProof/>
-                        </w:rPr>
-                        <w:t>0</w:t>
-                      </w:r>
-                      <w:r>
-                        <w:fldChar w:fldCharType="end"/>
-                      </w:r>
+                      <w:fldSimple w:instr=" STYLEREF 1 \s ">
+                        <w:r>
+                          <w:rPr>
+                            <w:noProof/>
+                          </w:rPr>
+                          <w:t>0</w:t>
+                        </w:r>
+                      </w:fldSimple>
                       <w:r>
                         <w:t>.</w:t>
                       </w:r>
-                      <w:r>
-                        <w:fldChar w:fldCharType="begin"/>
-                      </w:r>
-                      <w:r>
-                        <w:instrText xml:space="preserve"> SEQ Figure \* ARABIC \s 1 </w:instrText>
-                      </w:r>
-                      <w:r>
-                        <w:fldChar w:fldCharType="separate"/>
-                      </w:r>
-                      <w:r>
-                        <w:rPr>
-                          <w:noProof/>
-                        </w:rPr>
-                        <w:t>5</w:t>
-                      </w:r>
-                      <w:r>
-                        <w:fldChar w:fldCharType="end"/>
-                      </w:r>
+                      <w:fldSimple w:instr=" SEQ Figure \* ARABIC \s 1 ">
+                        <w:r>
+                          <w:rPr>
+                            <w:noProof/>
+                          </w:rPr>
+                          <w:t>5</w:t>
+                        </w:r>
+                      </w:fldSimple>
                       <w:r>
                         <w:t>: Sequence Padding</w:t>
                       </w:r>
@@ -10667,45 +10467,25 @@
       <w:r>
         <w:t xml:space="preserve">Figure </w:t>
       </w:r>
-      <w:r>
-        <w:fldChar w:fldCharType="begin"/>
-      </w:r>
-      <w:r>
-        <w:instrText xml:space="preserve"> STYLEREF 1 \s </w:instrText>
-      </w:r>
-      <w:r>
-        <w:fldChar w:fldCharType="separate"/>
-      </w:r>
-      <w:r>
-        <w:rPr>
-          <w:noProof/>
-        </w:rPr>
-        <w:t>0</w:t>
-      </w:r>
-      <w:r>
-        <w:fldChar w:fldCharType="end"/>
-      </w:r>
+      <w:fldSimple w:instr=" STYLEREF 1 \s ">
+        <w:r>
+          <w:rPr>
+            <w:noProof/>
+          </w:rPr>
+          <w:t>0</w:t>
+        </w:r>
+      </w:fldSimple>
       <w:r>
         <w:t>.</w:t>
       </w:r>
-      <w:r>
-        <w:fldChar w:fldCharType="begin"/>
-      </w:r>
-      <w:r>
-        <w:instrText xml:space="preserve"> SEQ Figure \* ARABIC \s 1 </w:instrText>
-      </w:r>
-      <w:r>
-        <w:fldChar w:fldCharType="separate"/>
-      </w:r>
-      <w:r>
-        <w:rPr>
-          <w:noProof/>
-        </w:rPr>
-        <w:t>6</w:t>
-      </w:r>
-      <w:r>
-        <w:fldChar w:fldCharType="end"/>
-      </w:r>
+      <w:fldSimple w:instr=" SEQ Figure \* ARABIC \s 1 ">
+        <w:r>
+          <w:rPr>
+            <w:noProof/>
+          </w:rPr>
+          <w:t>6</w:t>
+        </w:r>
+      </w:fldSimple>
       <w:r>
         <w:t>: Face Alignment</w:t>
       </w:r>
@@ -11032,45 +10812,25 @@
                             <w:r>
                               <w:t xml:space="preserve">Figure </w:t>
                             </w:r>
-                            <w:r>
-                              <w:fldChar w:fldCharType="begin"/>
-                            </w:r>
-                            <w:r>
-                              <w:instrText xml:space="preserve"> STYLEREF 1 \s </w:instrText>
-                            </w:r>
-                            <w:r>
-                              <w:fldChar w:fldCharType="separate"/>
-                            </w:r>
-                            <w:r>
-                              <w:rPr>
-                                <w:noProof/>
-                              </w:rPr>
-                              <w:t>0</w:t>
-                            </w:r>
-                            <w:r>
-                              <w:fldChar w:fldCharType="end"/>
-                            </w:r>
+                            <w:fldSimple w:instr=" STYLEREF 1 \s ">
+                              <w:r>
+                                <w:rPr>
+                                  <w:noProof/>
+                                </w:rPr>
+                                <w:t>0</w:t>
+                              </w:r>
+                            </w:fldSimple>
                             <w:r>
                               <w:t>.</w:t>
                             </w:r>
-                            <w:r>
-                              <w:fldChar w:fldCharType="begin"/>
-                            </w:r>
-                            <w:r>
-                              <w:instrText xml:space="preserve"> SEQ Figure \* ARABIC \s 1 </w:instrText>
-                            </w:r>
-                            <w:r>
-                              <w:fldChar w:fldCharType="separate"/>
-                            </w:r>
-                            <w:r>
-                              <w:rPr>
-                                <w:noProof/>
-                              </w:rPr>
-                              <w:t>1</w:t>
-                            </w:r>
-                            <w:r>
-                              <w:fldChar w:fldCharType="end"/>
-                            </w:r>
+                            <w:fldSimple w:instr=" SEQ Figure \* ARABIC \s 1 ">
+                              <w:r>
+                                <w:rPr>
+                                  <w:noProof/>
+                                </w:rPr>
+                                <w:t>1</w:t>
+                              </w:r>
+                            </w:fldSimple>
                             <w:r>
                               <w:t>: Artificial Neural Network</w:t>
                             </w:r>
@@ -11107,45 +10867,25 @@
                       <w:r>
                         <w:t xml:space="preserve">Figure </w:t>
                       </w:r>
-                      <w:r>
-                        <w:fldChar w:fldCharType="begin"/>
-                      </w:r>
-                      <w:r>
-                        <w:instrText xml:space="preserve"> STYLEREF 1 \s </w:instrText>
-                      </w:r>
-                      <w:r>
-                        <w:fldChar w:fldCharType="separate"/>
-                      </w:r>
-                      <w:r>
-                        <w:rPr>
-                          <w:noProof/>
-                        </w:rPr>
-                        <w:t>0</w:t>
-                      </w:r>
-                      <w:r>
-                        <w:fldChar w:fldCharType="end"/>
-                      </w:r>
+                      <w:fldSimple w:instr=" STYLEREF 1 \s ">
+                        <w:r>
+                          <w:rPr>
+                            <w:noProof/>
+                          </w:rPr>
+                          <w:t>0</w:t>
+                        </w:r>
+                      </w:fldSimple>
                       <w:r>
                         <w:t>.</w:t>
                       </w:r>
-                      <w:r>
-                        <w:fldChar w:fldCharType="begin"/>
-                      </w:r>
-                      <w:r>
-                        <w:instrText xml:space="preserve"> SEQ Figure \* ARABIC \s 1 </w:instrText>
-                      </w:r>
-                      <w:r>
-                        <w:fldChar w:fldCharType="separate"/>
-                      </w:r>
-                      <w:r>
-                        <w:rPr>
-                          <w:noProof/>
-                        </w:rPr>
-                        <w:t>1</w:t>
-                      </w:r>
-                      <w:r>
-                        <w:fldChar w:fldCharType="end"/>
-                      </w:r>
+                      <w:fldSimple w:instr=" SEQ Figure \* ARABIC \s 1 ">
+                        <w:r>
+                          <w:rPr>
+                            <w:noProof/>
+                          </w:rPr>
+                          <w:t>1</w:t>
+                        </w:r>
+                      </w:fldSimple>
                       <w:r>
                         <w:t>: Artificial Neural Network</w:t>
                       </w:r>
@@ -11850,45 +11590,25 @@
                             <w:r>
                               <w:t xml:space="preserve">Figure </w:t>
                             </w:r>
-                            <w:r>
-                              <w:fldChar w:fldCharType="begin"/>
-                            </w:r>
-                            <w:r>
-                              <w:instrText xml:space="preserve"> STYLEREF 1 \s </w:instrText>
-                            </w:r>
-                            <w:r>
-                              <w:fldChar w:fldCharType="separate"/>
-                            </w:r>
-                            <w:r>
-                              <w:rPr>
-                                <w:noProof/>
-                              </w:rPr>
-                              <w:t>0</w:t>
-                            </w:r>
-                            <w:r>
-                              <w:fldChar w:fldCharType="end"/>
-                            </w:r>
+                            <w:fldSimple w:instr=" STYLEREF 1 \s ">
+                              <w:r>
+                                <w:rPr>
+                                  <w:noProof/>
+                                </w:rPr>
+                                <w:t>0</w:t>
+                              </w:r>
+                            </w:fldSimple>
                             <w:r>
                               <w:t>.</w:t>
                             </w:r>
-                            <w:r>
-                              <w:fldChar w:fldCharType="begin"/>
-                            </w:r>
-                            <w:r>
-                              <w:instrText xml:space="preserve"> SEQ Figure \* ARABIC \s 1 </w:instrText>
-                            </w:r>
-                            <w:r>
-                              <w:fldChar w:fldCharType="separate"/>
-                            </w:r>
-                            <w:r>
-                              <w:rPr>
-                                <w:noProof/>
-                              </w:rPr>
-                              <w:t>2</w:t>
-                            </w:r>
-                            <w:r>
-                              <w:fldChar w:fldCharType="end"/>
-                            </w:r>
+                            <w:fldSimple w:instr=" SEQ Figure \* ARABIC \s 1 ">
+                              <w:r>
+                                <w:rPr>
+                                  <w:noProof/>
+                                </w:rPr>
+                                <w:t>2</w:t>
+                              </w:r>
+                            </w:fldSimple>
                             <w:r>
                               <w:t>: An Artificial Neural Network with a Bias</w:t>
                             </w:r>
@@ -11928,45 +11648,25 @@
                       <w:r>
                         <w:t xml:space="preserve">Figure </w:t>
                       </w:r>
-                      <w:r>
-                        <w:fldChar w:fldCharType="begin"/>
-                      </w:r>
-                      <w:r>
-                        <w:instrText xml:space="preserve"> STYLEREF 1 \s </w:instrText>
-                      </w:r>
-                      <w:r>
-                        <w:fldChar w:fldCharType="separate"/>
-                      </w:r>
-                      <w:r>
-                        <w:rPr>
-                          <w:noProof/>
-                        </w:rPr>
-                        <w:t>0</w:t>
-                      </w:r>
-                      <w:r>
-                        <w:fldChar w:fldCharType="end"/>
-                      </w:r>
+                      <w:fldSimple w:instr=" STYLEREF 1 \s ">
+                        <w:r>
+                          <w:rPr>
+                            <w:noProof/>
+                          </w:rPr>
+                          <w:t>0</w:t>
+                        </w:r>
+                      </w:fldSimple>
                       <w:r>
                         <w:t>.</w:t>
                       </w:r>
-                      <w:r>
-                        <w:fldChar w:fldCharType="begin"/>
-                      </w:r>
-                      <w:r>
-                        <w:instrText xml:space="preserve"> SEQ Figure \* ARABIC \s 1 </w:instrText>
-                      </w:r>
-                      <w:r>
-                        <w:fldChar w:fldCharType="separate"/>
-                      </w:r>
-                      <w:r>
-                        <w:rPr>
-                          <w:noProof/>
-                        </w:rPr>
-                        <w:t>2</w:t>
-                      </w:r>
-                      <w:r>
-                        <w:fldChar w:fldCharType="end"/>
-                      </w:r>
+                      <w:fldSimple w:instr=" SEQ Figure \* ARABIC \s 1 ">
+                        <w:r>
+                          <w:rPr>
+                            <w:noProof/>
+                          </w:rPr>
+                          <w:t>2</w:t>
+                        </w:r>
+                      </w:fldSimple>
                       <w:r>
                         <w:t>: An Artificial Neural Network with a Bias</w:t>
                       </w:r>
@@ -12837,45 +12537,25 @@
       <w:r>
         <w:t xml:space="preserve">Figure </w:t>
       </w:r>
-      <w:r>
-        <w:fldChar w:fldCharType="begin"/>
-      </w:r>
-      <w:r>
-        <w:instrText xml:space="preserve"> STYLEREF 1 \s </w:instrText>
-      </w:r>
-      <w:r>
-        <w:fldChar w:fldCharType="separate"/>
-      </w:r>
-      <w:r>
-        <w:rPr>
-          <w:noProof/>
-        </w:rPr>
-        <w:t>0</w:t>
-      </w:r>
-      <w:r>
-        <w:fldChar w:fldCharType="end"/>
-      </w:r>
+      <w:fldSimple w:instr=" STYLEREF 1 \s ">
+        <w:r>
+          <w:rPr>
+            <w:noProof/>
+          </w:rPr>
+          <w:t>0</w:t>
+        </w:r>
+      </w:fldSimple>
       <w:r>
         <w:t>.</w:t>
       </w:r>
-      <w:r>
-        <w:fldChar w:fldCharType="begin"/>
-      </w:r>
-      <w:r>
-        <w:instrText xml:space="preserve"> SEQ Figure \* ARABIC \s 1 </w:instrText>
-      </w:r>
-      <w:r>
-        <w:fldChar w:fldCharType="separate"/>
-      </w:r>
-      <w:r>
-        <w:rPr>
-          <w:noProof/>
-        </w:rPr>
-        <w:t>3</w:t>
-      </w:r>
-      <w:r>
-        <w:fldChar w:fldCharType="end"/>
-      </w:r>
+      <w:fldSimple w:instr=" SEQ Figure \* ARABIC \s 1 ">
+        <w:r>
+          <w:rPr>
+            <w:noProof/>
+          </w:rPr>
+          <w:t>3</w:t>
+        </w:r>
+      </w:fldSimple>
       <w:r>
         <w:t>: Image Showing an Artificial Neural Network</w:t>
       </w:r>
@@ -28378,45 +28058,25 @@
         <w:lastRenderedPageBreak/>
         <w:t xml:space="preserve">Figure </w:t>
       </w:r>
-      <w:r>
-        <w:fldChar w:fldCharType="begin"/>
-      </w:r>
-      <w:r>
-        <w:instrText xml:space="preserve"> STYLEREF 1 \s </w:instrText>
-      </w:r>
-      <w:r>
-        <w:fldChar w:fldCharType="separate"/>
-      </w:r>
-      <w:r>
-        <w:rPr>
-          <w:noProof/>
-        </w:rPr>
-        <w:t>0</w:t>
-      </w:r>
-      <w:r>
-        <w:fldChar w:fldCharType="end"/>
-      </w:r>
+      <w:fldSimple w:instr=" STYLEREF 1 \s ">
+        <w:r>
+          <w:rPr>
+            <w:noProof/>
+          </w:rPr>
+          <w:t>0</w:t>
+        </w:r>
+      </w:fldSimple>
       <w:r>
         <w:t>.</w:t>
       </w:r>
-      <w:r>
-        <w:fldChar w:fldCharType="begin"/>
-      </w:r>
-      <w:r>
-        <w:instrText xml:space="preserve"> SEQ Figure \* ARABIC \s 1 </w:instrText>
-      </w:r>
-      <w:r>
-        <w:fldChar w:fldCharType="separate"/>
-      </w:r>
-      <w:r>
-        <w:rPr>
-          <w:noProof/>
-        </w:rPr>
-        <w:t>4</w:t>
-      </w:r>
-      <w:r>
-        <w:fldChar w:fldCharType="end"/>
-      </w:r>
+      <w:fldSimple w:instr=" SEQ Figure \* ARABIC \s 1 ">
+        <w:r>
+          <w:rPr>
+            <w:noProof/>
+          </w:rPr>
+          <w:t>4</w:t>
+        </w:r>
+      </w:fldSimple>
       <w:r>
         <w:t>: Sample Matrix and a Kernel</w:t>
       </w:r>
@@ -28712,45 +28372,25 @@
       <w:r>
         <w:t xml:space="preserve">Figure </w:t>
       </w:r>
-      <w:r>
-        <w:fldChar w:fldCharType="begin"/>
-      </w:r>
-      <w:r>
-        <w:instrText xml:space="preserve"> STYLEREF 1 \s </w:instrText>
-      </w:r>
-      <w:r>
-        <w:fldChar w:fldCharType="separate"/>
-      </w:r>
-      <w:r>
-        <w:rPr>
-          <w:noProof/>
-        </w:rPr>
-        <w:t>0</w:t>
-      </w:r>
-      <w:r>
-        <w:fldChar w:fldCharType="end"/>
-      </w:r>
+      <w:fldSimple w:instr=" STYLEREF 1 \s ">
+        <w:r>
+          <w:rPr>
+            <w:noProof/>
+          </w:rPr>
+          <w:t>0</w:t>
+        </w:r>
+      </w:fldSimple>
       <w:r>
         <w:t>.</w:t>
       </w:r>
-      <w:r>
-        <w:fldChar w:fldCharType="begin"/>
-      </w:r>
-      <w:r>
-        <w:instrText xml:space="preserve"> SEQ Figure \* ARABIC \s 1 </w:instrText>
-      </w:r>
-      <w:r>
-        <w:fldChar w:fldCharType="separate"/>
-      </w:r>
-      <w:r>
-        <w:rPr>
-          <w:noProof/>
-        </w:rPr>
-        <w:t>5</w:t>
-      </w:r>
-      <w:r>
-        <w:fldChar w:fldCharType="end"/>
-      </w:r>
+      <w:fldSimple w:instr=" SEQ Figure \* ARABIC \s 1 ">
+        <w:r>
+          <w:rPr>
+            <w:noProof/>
+          </w:rPr>
+          <w:t>5</w:t>
+        </w:r>
+      </w:fldSimple>
       <w:r>
         <w:t>Feature Map</w:t>
       </w:r>
@@ -28873,45 +28513,25 @@
       <w:r>
         <w:t xml:space="preserve">Figure </w:t>
       </w:r>
-      <w:r>
-        <w:fldChar w:fldCharType="begin"/>
-      </w:r>
-      <w:r>
-        <w:instrText xml:space="preserve"> STYLEREF 1 \s </w:instrText>
-      </w:r>
-      <w:r>
-        <w:fldChar w:fldCharType="separate"/>
-      </w:r>
-      <w:r>
-        <w:rPr>
-          <w:noProof/>
-        </w:rPr>
-        <w:t>0</w:t>
-      </w:r>
-      <w:r>
-        <w:fldChar w:fldCharType="end"/>
-      </w:r>
+      <w:fldSimple w:instr=" STYLEREF 1 \s ">
+        <w:r>
+          <w:rPr>
+            <w:noProof/>
+          </w:rPr>
+          <w:t>0</w:t>
+        </w:r>
+      </w:fldSimple>
       <w:r>
         <w:t>.</w:t>
       </w:r>
-      <w:r>
-        <w:fldChar w:fldCharType="begin"/>
-      </w:r>
-      <w:r>
-        <w:instrText xml:space="preserve"> SEQ Figure \* ARABIC \s 1 </w:instrText>
-      </w:r>
-      <w:r>
-        <w:fldChar w:fldCharType="separate"/>
-      </w:r>
-      <w:r>
-        <w:rPr>
-          <w:noProof/>
-        </w:rPr>
-        <w:t>6</w:t>
-      </w:r>
-      <w:r>
-        <w:fldChar w:fldCharType="end"/>
-      </w:r>
+      <w:fldSimple w:instr=" SEQ Figure \* ARABIC \s 1 ">
+        <w:r>
+          <w:rPr>
+            <w:noProof/>
+          </w:rPr>
+          <w:t>6</w:t>
+        </w:r>
+      </w:fldSimple>
       <w:r>
         <w:t xml:space="preserve"> Filtering with a Stride of 1</w:t>
       </w:r>
@@ -29090,45 +28710,25 @@
       <w:r>
         <w:t xml:space="preserve">Figure </w:t>
       </w:r>
-      <w:r>
-        <w:fldChar w:fldCharType="begin"/>
-      </w:r>
-      <w:r>
-        <w:instrText xml:space="preserve"> STYLEREF 1 \s </w:instrText>
-      </w:r>
-      <w:r>
-        <w:fldChar w:fldCharType="separate"/>
-      </w:r>
-      <w:r>
-        <w:rPr>
-          <w:noProof/>
-        </w:rPr>
-        <w:t>0</w:t>
-      </w:r>
-      <w:r>
-        <w:fldChar w:fldCharType="end"/>
-      </w:r>
+      <w:fldSimple w:instr=" STYLEREF 1 \s ">
+        <w:r>
+          <w:rPr>
+            <w:noProof/>
+          </w:rPr>
+          <w:t>0</w:t>
+        </w:r>
+      </w:fldSimple>
       <w:r>
         <w:t>.</w:t>
       </w:r>
-      <w:r>
-        <w:fldChar w:fldCharType="begin"/>
-      </w:r>
-      <w:r>
-        <w:instrText xml:space="preserve"> SEQ Figure \* ARABIC \s 1 </w:instrText>
-      </w:r>
-      <w:r>
-        <w:fldChar w:fldCharType="separate"/>
-      </w:r>
-      <w:r>
-        <w:rPr>
-          <w:noProof/>
-        </w:rPr>
-        <w:t>7</w:t>
-      </w:r>
-      <w:r>
-        <w:fldChar w:fldCharType="end"/>
-      </w:r>
+      <w:fldSimple w:instr=" SEQ Figure \* ARABIC \s 1 ">
+        <w:r>
+          <w:rPr>
+            <w:noProof/>
+          </w:rPr>
+          <w:t>7</w:t>
+        </w:r>
+      </w:fldSimple>
       <w:r>
         <w:t>: Padding in CNNs</w:t>
       </w:r>
@@ -29403,45 +29003,25 @@
       <w:r>
         <w:t xml:space="preserve">Figure </w:t>
       </w:r>
-      <w:r>
-        <w:fldChar w:fldCharType="begin"/>
-      </w:r>
-      <w:r>
-        <w:instrText xml:space="preserve"> STYLEREF 1 \s </w:instrText>
-      </w:r>
-      <w:r>
-        <w:fldChar w:fldCharType="separate"/>
-      </w:r>
-      <w:r>
-        <w:rPr>
-          <w:noProof/>
-        </w:rPr>
-        <w:t>0</w:t>
-      </w:r>
-      <w:r>
-        <w:fldChar w:fldCharType="end"/>
-      </w:r>
+      <w:fldSimple w:instr=" STYLEREF 1 \s ">
+        <w:r>
+          <w:rPr>
+            <w:noProof/>
+          </w:rPr>
+          <w:t>0</w:t>
+        </w:r>
+      </w:fldSimple>
       <w:r>
         <w:t>.</w:t>
       </w:r>
-      <w:r>
-        <w:fldChar w:fldCharType="begin"/>
-      </w:r>
-      <w:r>
-        <w:instrText xml:space="preserve"> SEQ Figure \* ARABIC \s 1 </w:instrText>
-      </w:r>
-      <w:r>
-        <w:fldChar w:fldCharType="separate"/>
-      </w:r>
-      <w:r>
-        <w:rPr>
-          <w:noProof/>
-        </w:rPr>
-        <w:t>8</w:t>
-      </w:r>
-      <w:r>
-        <w:fldChar w:fldCharType="end"/>
-      </w:r>
+      <w:fldSimple w:instr=" SEQ Figure \* ARABIC \s 1 ">
+        <w:r>
+          <w:rPr>
+            <w:noProof/>
+          </w:rPr>
+          <w:t>8</w:t>
+        </w:r>
+      </w:fldSimple>
       <w:r>
         <w:t>: Max pooling and average pooling</w:t>
       </w:r>
@@ -29516,7 +29096,19 @@
         <w:rPr>
           <w:rFonts w:ascii="Times New Roman" w:hAnsi="Times New Roman" w:cs="Times New Roman"/>
         </w:rPr>
-        <w:t xml:space="preserve"> when the model is still being updated. This technique occurs by adjusting the values in each variable </w:t>
+        <w:t xml:space="preserve"> when the model is still being updated. </w:t>
+      </w:r>
+      <w:r>
+        <w:rPr>
+          <w:rFonts w:ascii="Times New Roman" w:hAnsi="Times New Roman" w:cs="Times New Roman"/>
+        </w:rPr>
+        <w:t>That said, t</w:t>
+      </w:r>
+      <w:r>
+        <w:rPr>
+          <w:rFonts w:ascii="Times New Roman" w:hAnsi="Times New Roman" w:cs="Times New Roman"/>
+        </w:rPr>
+        <w:t xml:space="preserve">his technique occurs by adjusting the values in each variable </w:t>
       </w:r>
       <w:r>
         <w:rPr>

</xml_diff>